<commit_message>
deliver: refresh narration with reordered pages and multi-select answers
</commit_message>
<xml_diff>
--- a/交付文件/合理用药_双人逐页讲稿.docx
+++ b/交付文件/合理用药_双人逐页讲稿.docx
@@ -273,12 +273,12 @@
     </w:p>
     <w:p>
       <w:r>
-        <w:t>计时是演讲目标，不是自动播放。稿件约5700个汉字，另有停顿、读题、举手与同桌讨论，按自然讲解语速排练后校准。首次完整计时，优先把总时长控制在34—36分钟；不要为凑时间机械拖慢每句话。</w:t>
+        <w:t>计时是演讲目标，不是自动播放。稿件文字量以本次生成的逐页讲稿为准，另有停顿、读题、举手与同桌讨论，按自然讲解语速排练后校准。首次完整计时，优先把总时长控制在34—36分钟；不要为凑时间机械拖慢每句话。</w:t>
       </w:r>
     </w:p>
     <w:p>
       <w:r>
-        <w:t>到第5页末应约5分钟，第19页末约22分钟，第26页末约30分钟。超时1分钟：压缩第18页重复解释约30秒，并将第19页同桌讨论与点评合计缩短30秒。提前1分钟：按稿中停顿完整读图，补充解释第8页“模拟任务”和第13页“两种口径”，不要临时增加医学结论。</w:t>
+        <w:t>到第5页末应约5分钟，第19页末约22分钟，第26页末约30分钟。超时1分钟：压缩第18页重复解释约30秒，并将第19页同桌讨论与点评合计缩短30秒。提前1分钟：按稿中停顿完整读图，补充讨论第8页的信息缺口和第13页的两种比较假设，不要临时增加医学结论。</w:t>
       </w:r>
     </w:p>
     <w:p>
@@ -314,12 +314,35 @@
         <w:pStyle w:val="Heading1"/>
       </w:pPr>
       <w:r>
-        <w:t>02｜室友感冒了，你先做哪一步？</w:t>
+        <w:t>02｜今天的路线：从会判断，到会行动</w:t>
       </w:r>
     </w:p>
     <w:p>
       <w:r>
-        <w:t>主讲：甲　建议：90秒　累计：00:45—02:15</w:t>
+        <w:t>主讲：甲　建议：45秒　累计：00:45—01:30</w:t>
+      </w:r>
+    </w:p>
+    <w:p>
+      <w:r>
+        <w:t>舞台提示：移至封面后的第2页；先交代路线，再进入原第2页的开场选择题，不提前揭晓答案。</w:t>
+      </w:r>
+    </w:p>
+    <w:p>
+      <w:r>
+        <w:t>甲：先用这张路线图，看看今天怎么给宿舍药箱上堂课。前五分钟建立判断原则；接着用十七分钟看五类校园误区：重复成分、抗生素、备考提神、抗过敏药，以及药物与饮酒。然后用八分钟练习安全用药的方法，最后五分钟替小苏做一次综合选择。甲负责前半段，乙负责后半段，举手互动已包含在时间里。大家只需选下一步，不用背药名或计算剂量。现在进入第一个情境：室友感冒了，你会先做哪一步？</w:t>
+      </w:r>
+    </w:p>
+    <w:p>
+      <w:pPr>
+        <w:pStyle w:val="Heading1"/>
+      </w:pPr>
+      <w:r>
+        <w:t>03｜室友感冒了，你先做哪一步？</w:t>
+      </w:r>
+    </w:p>
+    <w:p>
+      <w:r>
+        <w:t>主讲：甲　建议：90秒　累计：01:30—03:00</w:t>
       </w:r>
     </w:p>
     <w:p>
@@ -329,17 +352,17 @@
     </w:p>
     <w:p>
       <w:r>
-        <w:t>甲：先进入一个虚构情境。小苏明天有课，今天流鼻涕、喉咙不舒服，室友递来两盒感冒药，另一位室友说，加一粒抗生素更保险。现在只选第一步，不需要给出具体药名。请大家先用十秒看完三个选项。</w:t>
+        <w:t>甲：小苏流鼻涕、喉咙不舒服，明天还有课。药箱里有上次剩下的药，室友也递来一盒。沿用经验、先核信息、按症状挑药，三个方案都像是在解决问题。信息还不完整时，你选哪一个第一步？</w:t>
       </w:r>
     </w:p>
     <w:p>
       <w:r>
-        <w:t>【静默10秒】甲依次读A、B、C，每个选项留5秒举手。乙观察大致人数，不做精确统计，也不点名问理由。</w:t>
+        <w:t>【静默10秒；A、B、C依次举手，各约5秒】</w:t>
       </w:r>
     </w:p>
     <w:p>
       <w:r>
-        <w:t>甲：谢谢。无论你刚才选了哪个，今天都会解释这些选择背后的差别。选择B，是先获取决定所需的信息；这并不等于自己诊断所有疾病。我们先把答案放在心里，结束时再看看能否把这个动作做得更完整。</w:t>
+        <w:t>甲：先保留选择。上次有效不代表这次适用，包装上的症状描述也不能代替核对；下一页看判断需要哪些信息。</w:t>
       </w:r>
     </w:p>
     <w:p>
@@ -347,12 +370,12 @@
         <w:pStyle w:val="Heading1"/>
       </w:pPr>
       <w:r>
-        <w:t>03｜合理用药，要同时过四关</w:t>
+        <w:t>04｜合理用药，要同时过四关</w:t>
       </w:r>
     </w:p>
     <w:p>
       <w:r>
-        <w:t>主讲：甲　建议：60秒　累计：02:15—03:15</w:t>
+        <w:t>主讲：甲　建议：60秒　累计：03:00—04:00</w:t>
       </w:r>
     </w:p>
     <w:p>
@@ -370,17 +393,17 @@
         <w:pStyle w:val="Heading1"/>
       </w:pPr>
       <w:r>
-        <w:t>04｜高中生物连接：药物也要找“靶点”</w:t>
+        <w:t>05｜鼻子舒服了，为什么上课却犯困？</w:t>
       </w:r>
     </w:p>
     <w:p>
       <w:r>
-        <w:t>主讲：甲　建议：60秒　累计：03:15—04:15</w:t>
+        <w:t>主讲：甲　建议：60秒　累计：04:00—05:00</w:t>
       </w:r>
     </w:p>
     <w:p>
       <w:r>
-        <w:t>甲：回忆高中生物，我们学过蛋白质的结构与功能，也学过酶和细胞间的信息传递。理解药物，可以先用一个简化模型：有些药物与受体结合，改变信号；有些药物影响酶的作用，改变某个反应过程。图中用形状匹配表示识别，它只是一种示意，并不是所有药物都像一把钥匙只开一把锁。相同或相关的靶点可能存在于多个部位，所以治疗作用和其他作用可能同时出现。稍后讲抗过敏药为什么让人困，就会用到这个思路。</w:t>
+        <w:t>甲：小苏吃了抗过敏药，鼻子舒服了，上课却开始犯困。药明明在起作用，怎么还会影响精神？先看图里的两个位置：组胺在鼻部参与部分过敏反应，在脑内也参与维持清醒。部分抗组胺药能进入脑内，影响相关信号，因此可能在缓解过敏症状的同时让人困倦。这就是生物课里的“信号传递”在生活中的一个例子：同一种信号物质，在不同位置可以参与不同功能。不是所有抗过敏药都一样，也不是人人都会困。对我们有用的结论是：选择药物时，不只问能不能缓解症状，还要查嗜睡提示，向药师说清白天有课或需要通勤；已经困倦时，避免驾驶、骑车等高风险活动。后面再展开解释这个机制。</w:t>
       </w:r>
     </w:p>
     <w:p>
@@ -393,25 +416,7 @@
         <w:pStyle w:val="Heading1"/>
       </w:pPr>
       <w:r>
-        <w:t>05｜今天的路线：从会判断，到会行动</w:t>
-      </w:r>
-    </w:p>
-    <w:p>
-      <w:r>
-        <w:t>主讲：甲　建议：45秒　累计：04:15—05:00</w:t>
-      </w:r>
-    </w:p>
-    <w:p>
-      <w:r>
-        <w:t>甲：今天分四部分。我们已经用五分钟建立基本原则，接着用十七分钟看宿舍里容易遇到的五类误区：重复成分、抗生素、备考提神、抗过敏药，以及药物与饮酒。然后用八分钟把知识变成一套操作方法，最后五分钟做一道简单综合题。甲负责前半段，乙负责后半段；投票时另一位同学帮忙观察。大家只需要做选择，不必临时组织一段观点，也不需要公开自己的疾病或用药经历。</w:t>
-      </w:r>
-    </w:p>
-    <w:p>
-      <w:pPr>
-        <w:pStyle w:val="Heading1"/>
-      </w:pPr>
-      <w:r>
-        <w:t>06｜案例①：两盒感冒药，真是“双保险”？</w:t>
+        <w:t>06｜两盒药，是“双保险”还是撞车？</w:t>
       </w:r>
     </w:p>
     <w:p>
@@ -421,7 +426,7 @@
     </w:p>
     <w:p>
       <w:r>
-        <w:t>甲：第一幕还是小苏。他拿到两盒药，一盒包装强调缓解头痛，一盒写着缓解感冒症状，于是直觉上觉得，一个管头，一个管感冒，应该互不冲突。但宣传的症状不同，不代表里面的有效成分不同。比如，对乙酰氨基酚既可以作为单一成分用于解热镇痛，也可能出现在复方感冒药里。两盒一起吃时，身体接收到的是所有来源的总量。我们在这里不推荐具体品牌，也不演示个人用药剂量，先练最重要的动作：把两份说明书的成分栏摆在一起比较。包装上的大字可以吸引注意，成分栏才是判断重复的依据。</w:t>
+        <w:t>甲：小苏觉得头痛还没缓解，拿起另一盒感冒药。室友说，名字不同，一盒管头痛、一盒管感冒，听起来像双保险。三格漫画从不舒服，到听起来合理的建议，再把判断停在药盒背面。症状宣传不同，不代表有效成分不同。下一页不算剂量，只把成分摆在一起，看双保险有没有变成重复。</w:t>
       </w:r>
     </w:p>
     <w:p>
@@ -434,7 +439,7 @@
         <w:pStyle w:val="Heading1"/>
       </w:pPr>
       <w:r>
-        <w:t>07｜看成分，才能发现“隐形重复”</w:t>
+        <w:t>07｜药盒不同，成分可能“撞车”</w:t>
       </w:r>
     </w:p>
     <w:p>
@@ -444,7 +449,7 @@
     </w:p>
     <w:p>
       <w:r>
-        <w:t>甲：这两个标签是教学示意，不对应具体产品。请看红色框出的同一个名字：对乙酰氨基酚。即使两盒药的商品名、用途描述和包装颜色不同，这个成分仍然会重复进入体内。判断时，不能把药盒当作两个互不相关的单位。特别是复方药，一盒里就可能有多种有效成分，所以更需要逐项核对。看到重复后，先不要自行叠加；拿着具体药名、规格和已经服用的时间，向药师确认。如果怀疑已经超量，也不能因为暂时没有不舒服就继续等，应及时获得医疗帮助。</w:t>
+        <w:t>甲：左边是单方退热止痛药的教学标签，只有对乙酰氨基酚；右边的复方感冒药示例另有马来酸氯苯那敏和盐酸伪麻黄碱。组成不完全相同，但同一个红色成分块出现了两次，其他成分的不同不能抵消重复。先把真实说明书的成分逐项对照，再核规格、已经服用的时间和用量，拿不准就带药盒问药师。这两张教学标签不对应具体产品，不给出剂量；不同产品的组成和要求可能不同。</w:t>
       </w:r>
     </w:p>
     <w:p>
@@ -457,7 +462,7 @@
         <w:pStyle w:val="Heading1"/>
       </w:pPr>
       <w:r>
-        <w:t>08｜真实研究：模拟用药，也容易出错</w:t>
+        <w:t>08｜18点吃过药，20点还痛：先补哪条信息？</w:t>
       </w:r>
     </w:p>
     <w:p>
@@ -467,12 +472,12 @@
     </w:p>
     <w:p>
       <w:r>
-        <w:t>甲：我们用一项研究说明，读懂药品标签并没有想象中简单。研究发表于2012年，纳入美国门诊的500名成人，让他们完成非处方对乙酰氨基酚产品的模拟用药任务。23.8%的参与者在单一产品任务中安排出了超过研究判定阈值的用量，45.6%在联用任务中出现重复成分造成的潜在超量。请注意，这是模拟任务，不代表这些人实际中毒，更不能推算我们班或中国大学生的发生率。两项指标也可能来自同一名参与者，所以不能相加。我们从图中带走的结论是：核对成分需要一个具体动作，不能只靠“我应该记得”。</w:t>
+        <w:t>甲：18点，小苏服过一种复方感冒药；20点仍然头痛，想加另一盒退热药。这两个时间只是故事线索，不表示隔两小时就能加药。现在要补齐两盒药的具体药名、成分、规格，以及今天何时用了多少。核对重复和累计使用，不能靠症状还在就自行加量，也不能套统一间隔。怀疑超量或误服应及时寻求医疗帮助；症状持续、加重也应按说明书就医提示处理。下一页只选获取这些信息的下一步。</w:t>
       </w:r>
     </w:p>
     <w:p>
       <w:r>
-        <w:t>本页依据：S3</w:t>
+        <w:t>本页依据：S2</w:t>
       </w:r>
     </w:p>
     <w:p>
@@ -480,7 +485,7 @@
         <w:pStyle w:val="Heading1"/>
       </w:pPr>
       <w:r>
-        <w:t>09｜选择题②：两盒都含相同成分，怎么办？</w:t>
+        <w:t>09｜室友群的三条消息，你给哪条点赞？</w:t>
       </w:r>
     </w:p>
     <w:p>
@@ -495,17 +500,17 @@
     </w:p>
     <w:p>
       <w:r>
-        <w:t>甲：现在把刚才学到的动作再练一次。已知两盒药都含有对乙酰氨基酚，我们仍然不知道具体规格、适用人群，也不知道小苏还吃过什么。三个选项中，哪一个最稳妥？请先安静想十秒。</w:t>
+        <w:t>甲：室友群里弹出三条消息。A让我们找重复成分，B建议错开服药时间，C让我们补齐今天的药名、规格和时间。可以给多条消息点赞，选择的是现在有助于判断的建议，不是替小苏开药。</w:t>
       </w:r>
     </w:p>
     <w:p>
       <w:r>
-        <w:t>【静默10秒】甲依次读A、B、C，乙观察举手，各留5秒。</w:t>
+        <w:t>【静默10秒；逐条举手各约5秒，可多次举手】</w:t>
       </w:r>
     </w:p>
     <w:p>
       <w:r>
-        <w:t>甲：这题不需要计算药量。特别留意B，它看起来很谨慎，因为把量减了，但它仍然是在缺少信息时自行拼接方案。我们今天练的是先识别风险，再补齐信息，而不是凭感觉把两盒药重新配方。下一页揭晓。</w:t>
+        <w:t>甲：请保留选择，下一页看哪些建议补齐了信息，哪些只是让安排听起来谨慎。</w:t>
       </w:r>
     </w:p>
     <w:p>
@@ -518,7 +523,7 @@
         <w:pStyle w:val="Heading1"/>
       </w:pPr>
       <w:r>
-        <w:t>10｜答案 C：先核对，再决定</w:t>
+        <w:t>10｜答案 A＋C：先把两类信息凑齐</w:t>
       </w:r>
     </w:p>
     <w:p>
@@ -528,7 +533,7 @@
     </w:p>
     <w:p>
       <w:r>
-        <w:t>甲：答案是C。A忽略了成分，B在不知道规格和总量时自行改方案，二者都不可靠。C把操作顺序摆正：先不叠加，再核对，必要时请药师判断。询问时最好带上包装或清晰照片，同时说清已经吃过什么、吃了多少和什么时候吃的，这样对方才能给出有依据的建议。</w:t>
+        <w:t>甲：可以同时给A和C点赞。A找到共有成分，C补齐具体规格与已服记录，两条合起来才更有助于判断。B听起来考虑了时间，但并没有核清成分、规格和累计使用；不能靠错开就推定合用安全。先不自行叠加，带齐这些信息问药师。</w:t>
       </w:r>
     </w:p>
     <w:p>
@@ -587,7 +592,7 @@
         <w:pStyle w:val="Heading1"/>
       </w:pPr>
       <w:r>
-        <w:t>13｜耐药风险，有多大？看清数据口径</w:t>
+        <w:t>13｜495万与127万：是在回答两个问题</w:t>
       </w:r>
     </w:p>
     <w:p>
@@ -597,7 +602,7 @@
     </w:p>
     <w:p>
       <w:r>
-        <w:t>甲：这里用的是2022年发表于《柳叶刀》的研究，对2019年全球细菌耐药负担进行估计。较宽的“相关”口径约为495万例死亡，而“归因”口径约为127万例。两者的比较假设不同：前者比较没有这类耐药感染的情况，后者比较感染仍然发生、但细菌对药物敏感的情况。它们不能相加，也不能理解为所有死亡都由个人乱吃抗生素造成。图上的细线是不确定性区间，提醒我们这些数字是模型估计，不是精确清点。我们引用这组历史数据说明耐药问题的重要性，并不把它称为今年的最新统计。</w:t>
+        <w:t>甲：两个数字不是两组互不重叠的人，而是用两种假设比较同一类耐药感染的负担。相关死亡约495万人，比较实际发生这类感染与没有这类感染。归因死亡约127万人，保留感染发生，但假设细菌对抗菌药物敏感，估计耐药性额外造成的死亡。一个问如果没有这类感染，一个问感染仍在但药能对付细菌。因此不能相加，也不能把495万全部说成耐药性额外造成，更不能全部归咎于个人乱用药。右侧两条独立条形共用从零开始的刻度，点和细线表示估计与95%不确定性区间。这是2019年全球模型估计，发表于2022年。</w:t>
       </w:r>
     </w:p>
     <w:p>
@@ -633,7 +638,7 @@
         <w:pStyle w:val="Heading1"/>
       </w:pPr>
       <w:r>
-        <w:t>15｜案例③：“备考外挂”，真的值得试？</w:t>
+        <w:t>15｜考试周的“外挂”，谁在给它背书？</w:t>
       </w:r>
     </w:p>
     <w:p>
@@ -643,7 +648,7 @@
     </w:p>
     <w:p>
       <w:r>
-        <w:t>甲：第三个情境发生在考试周。小苏看到“提升专注、快速提分”的宣传，又听说有人借用治疗注意缺陷多动障碍的处方药来熬夜。这里要分开看：保健食品与药品不是一回事，不能用保健食品替代疾病治疗，也不能把某种功能声称直接等同于提高考试成绩。而处方兴奋剂有明确适应证，非医疗使用存在失眠、焦虑、成瘾及过量等风险，不能因为别人说有效就借来试。对需要这些药物的患者，规范治疗有价值；我们反对的是把别人的处方当作通用学习工具。</w:t>
+        <w:t>甲：考试周，小苏看见专注加倍、快速提分的广告，室友又说有人借用处方兴奋剂熬夜。悬念不是哪一种更厉害，而是广告和别人经验能否证明适合小苏。保健食品不能替代药物治疗疾病，功能声称不等于提分保证。处方兴奋剂对有适应证的患者，规范治疗有价值；借用他人处方进行非医疗使用，则存在失眠、焦虑、成瘾及过量等风险。合理用药要核实适用依据，不借用他人的处方，也不让考试焦虑替自己决定。</w:t>
       </w:r>
     </w:p>
     <w:p>
@@ -689,7 +694,7 @@
         <w:pStyle w:val="Heading1"/>
       </w:pPr>
       <w:r>
-        <w:t>17｜同一条信号，在不同部位有不同作用</w:t>
+        <w:t>17｜同一种组胺信号，为什么有两种影响？</w:t>
       </w:r>
     </w:p>
     <w:p>
@@ -699,7 +704,7 @@
     </w:p>
     <w:p>
       <w:r>
-        <w:t>乙：接着刚才的问题。组胺是一种参与信号传递的物质，在外周组织中，它参与部分过敏症状；在脑内，相关信号也参与维持清醒状态。部分抗组胺药能够进入脑内，影响相应的受体作用，因此在缓解过敏症状的同时，也可能让人困倦。这里可以连接高中生物中的信息传递和内环境：同一种信号分子，在不同位置可能参与不同功能。我们把复杂机制压缩成这张示意图，是为了说明作用为什么可能同时发生，而不是让大家按这张图自行选择药物或调整剂量。</w:t>
+        <w:t>乙：左侧，组胺与H1受体相关的信号参与部分过敏反应；抗组胺药影响相应受体的作用，可以缓解部分症状。右侧，脑内组胺信号也参与维持清醒。血脑屏障是进入脑内的一道选择性屏障，不是对所有药物都完全封闭；部分抗组胺药能够进入脑内，影响相关受体信号，因此可能嗜睡。两条路径解释治疗作用与其他影响为什么可能同时发生，不表示每种药、每个人都一样。具体选择看说明书和药师建议；困倦时避开驾驶、骑车等高风险活动。</w:t>
       </w:r>
     </w:p>
     <w:p>
@@ -745,7 +750,7 @@
         <w:pStyle w:val="Heading1"/>
       </w:pPr>
       <w:r>
-        <w:t>19｜选择题③：聚餐前，选哪条路线？</w:t>
+        <w:t>19｜聚餐群里的建议，哪条先解决未知？</w:t>
       </w:r>
     </w:p>
     <w:p>
@@ -760,17 +765,17 @@
     </w:p>
     <w:p>
       <w:r>
-        <w:t>乙：这一题仍然只选下一步。今天已经服过抗过敏药，但没有确认具体药品的饮酒要求，晚上聚餐时怎样做更合适？请大家看完三个选项，可以和旁边同学小声商量二十秒，只需要最后选一个字母。</w:t>
+        <w:t>乙：今天服过抗过敏药，具体饮酒要求没确认。三个方案都像在控制风险：垫肚子并错开、沿用经验并少喝、换白水再核药名。请讨论二十秒，选更有依据的下一步。</w:t>
       </w:r>
     </w:p>
     <w:p>
       <w:r>
-        <w:t>【同桌讨论20秒】甲负责依次示意A、B、C，乙主持，给每个选项约5秒举手。</w:t>
+        <w:t>【讨论20秒；依次举手各约5秒】</w:t>
       </w:r>
     </w:p>
     <w:p>
       <w:r>
-        <w:t>乙：这里有两个很容易误导人的线索，一个是时间，一个是醉不醉。药物相互作用不能靠统一间隔来排除，也不是只有喝醉才可能发生。正确答案是B：看这一个具体药品的要求；如果暂时不能确认，先不喝。即使全班都选对，也值得保留这个动作，因为聚餐时的社交压力容易让人把已经知道的原则放到一边。现在五个情境都看过了，我们把它们整理成一个可以重复使用的方法。</w:t>
+        <w:t>乙：答案C。固定等两小时、酒不烈或以前没出事，都不能证明这一药品与酒精合用没有风险。信息未确认时先不喝，再查具体说明书或问药师。</w:t>
       </w:r>
     </w:p>
     <w:p>
@@ -793,7 +798,7 @@
     </w:p>
     <w:p>
       <w:r>
-        <w:t>乙：第三部分，我们把前面的例子浓缩成四个动作：看、核、问、记。看，是观察症状，也看说明书和需要就医的信号。核，是核对成分有没有重复，剂量与时间是否符合要求，自己有没有相关禁忌。问，是把不确定的地方交给医生或药师确认，不用猜测填空。记，是记录已经用过的药、时间、用量以及出现的反应。上一题选B，就把“这盒药能不能配酒”的不确定性变成了一个清楚的咨询问题。这四步是课堂助记法，不是替代诊疗的专业流程。</w:t>
+        <w:t>乙：第三部分，我们把前面的例子浓缩成四个动作：看、核、问、记。看，是观察症状，也看说明书和需要就医的信号。核，是核对成分有没有重复，剂量与时间是否符合要求，自己有没有相关禁忌。问，是把不确定的地方交给医生或药师确认，不用猜测填空。记，是记录已经用过的药、时间、用量以及出现的反应。上一题选C，就把“这盒药能不能配酒”的不确定性变成了一个清楚的咨询问题。这四步是课堂助记法，不是替代诊疗的专业流程。</w:t>
       </w:r>
     </w:p>
     <w:p>
@@ -962,7 +967,7 @@
         <w:pStyle w:val="Heading1"/>
       </w:pPr>
       <w:r>
-        <w:t>28｜你会替小苏选哪个方案？</w:t>
+        <w:t>28｜小苏的晚间计划，你采纳哪几条？</w:t>
       </w:r>
     </w:p>
     <w:p>
@@ -977,17 +982,17 @@
     </w:p>
     <w:p>
       <w:r>
-        <w:t>乙：请看三个方案。A，两盒一起吃，聚餐少喝一点。B，先核对成分，拿不准问药师，在没有确认之前先不喝酒。C，加抗生素预防一下，明天再看。大家先自己想十秒。</w:t>
+        <w:t>乙：这次可以采纳多条建议。A处理聚餐饮酒的不确定性，B准备药盒和已服记录，C沿用上次经验调整第二盒的时间。请判断哪些能补齐题目里的未知信息，再把采纳的建议拼成小苏今晚的计划。</w:t>
       </w:r>
     </w:p>
     <w:p>
       <w:r>
-        <w:t>【静默10秒】甲依次邀请选A、B、C的同学举手，每个选项约5秒；乙观察，不要求任何人解释。</w:t>
+        <w:t>【静默10秒；依次举手各约5秒，可以多次举手】</w:t>
       </w:r>
     </w:p>
     <w:p>
       <w:r>
-        <w:t>乙：这一题里，B包含的都是我们已经练过的动作；A和C则各自跳过了关键信息。请保留自己的选择，下一页我们按三条线索逐项核对。即使刚才已经猜到答案，也可以再看一遍：你是凭“这个选项最长”选的，还是确实找到了成分、酒精和抗生素三个判断点？</w:t>
+        <w:t>乙：先保留选择。下一页分别核对饮酒、成分与已服情况，不用靠哪个选项最长来猜。</w:t>
       </w:r>
     </w:p>
     <w:p>
@@ -995,7 +1000,7 @@
         <w:pStyle w:val="Heading1"/>
       </w:pPr>
       <w:r>
-        <w:t>29｜答案 B：三个判断点，全都用上了</w:t>
+        <w:t>29｜答案 A＋B：把建议拼成完整行动</w:t>
       </w:r>
     </w:p>
     <w:p>
@@ -1010,17 +1015,17 @@
     </w:p>
     <w:p>
       <w:r>
-        <w:t>乙：答案是B。我们把题目拆成三步。第一，另一盒药成分不清楚，不能因为症状还在就直接叠加。第二，具体药物的饮酒要求没有确认，先不喝比凭酒量判断更稳妥。第三，题目没有提供使用抗生素的依据，“预防一下”不能替代医生评估。这三条一起组成了更有依据的下一步。</w:t>
+        <w:t>乙：A与B可以一起采纳。A在饮酒要求明确之前先不喝，B把具体药名、规格、成分、何时用了多少一起交给药师核对。C沿用上次经验把药改到睡前，没有解决现在的重复成分和累计使用问题。</w:t>
       </w:r>
     </w:p>
     <w:p>
       <w:r>
-        <w:t>甲：也补充一句，B不是要求小苏一直待在宿舍查说明书。如果症状持续、加重，或者出现呼吸困难、明显意识异常等情况，行动就应该转为及时就医或急救。</w:t>
+        <w:t>甲：症状持续、加重或出现呼吸困难、意识异常等急症表现，要转为就医或急救。</w:t>
       </w:r>
     </w:p>
     <w:p>
       <w:r>
-        <w:t>乙：所以合理用药不是背出一个永远适用的药方，而是根据已经掌握的信息，选对接下来的动作。今天这道题不难，目的是让大家能把这个顺序带回真实生活。</w:t>
+        <w:t>乙：两条建议拼成完整行动，才比一个听起来谨慎的安排更有依据。</w:t>
       </w:r>
     </w:p>
     <w:p>
@@ -1135,17 +1140,7 @@
           </w:tcPr>
           <w:p>
             <w:r>
-              <w:t>开场选择</w:t>
-            </w:r>
-          </w:p>
-        </w:tc>
-        <w:tc>
-          <w:tcPr>
-            <w:tcW w:type="dxa" w:w="2498"/>
-          </w:tcPr>
-          <w:p>
-            <w:r>
-              <w:t>2</w:t>
+              <w:t>开场选择（单选）</w:t>
             </w:r>
           </w:p>
         </w:tc>
@@ -1156,6 +1151,16 @@
           <w:p>
             <w:r>
               <w:t>3</w:t>
+            </w:r>
+          </w:p>
+        </w:tc>
+        <w:tc>
+          <w:tcPr>
+            <w:tcW w:type="dxa" w:w="2498"/>
+          </w:tcPr>
+          <w:p>
+            <w:r>
+              <w:t>4</w:t>
             </w:r>
           </w:p>
         </w:tc>
@@ -1177,7 +1182,7 @@
           </w:tcPr>
           <w:p>
             <w:r>
-              <w:t>重复成分</w:t>
+              <w:t>重复成分（多选）</w:t>
             </w:r>
           </w:p>
         </w:tc>
@@ -1207,7 +1212,7 @@
           </w:tcPr>
           <w:p>
             <w:r>
-              <w:t>C</w:t>
+              <w:t>A＋C</w:t>
             </w:r>
           </w:p>
         </w:tc>
@@ -1219,7 +1224,7 @@
           </w:tcPr>
           <w:p>
             <w:r>
-              <w:t>聚餐饮酒</w:t>
+              <w:t>聚餐饮酒（单选）</w:t>
             </w:r>
           </w:p>
         </w:tc>
@@ -1249,7 +1254,7 @@
           </w:tcPr>
           <w:p>
             <w:r>
-              <w:t>B</w:t>
+              <w:t>C</w:t>
             </w:r>
           </w:p>
         </w:tc>
@@ -1261,7 +1266,7 @@
           </w:tcPr>
           <w:p>
             <w:r>
-              <w:t>综合挑战</w:t>
+              <w:t>综合挑战（多选）</w:t>
             </w:r>
           </w:p>
         </w:tc>
@@ -1291,7 +1296,7 @@
           </w:tcPr>
           <w:p>
             <w:r>
-              <w:t>B</w:t>
+              <w:t>A＋B</w:t>
             </w:r>
           </w:p>
         </w:tc>

</xml_diff>

<commit_message>
deliver: synchronize narration and question-before-case reveal
</commit_message>
<xml_diff>
--- a/交付文件/合理用药_双人逐页讲稿.docx
+++ b/交付文件/合理用药_双人逐页讲稿.docx
@@ -14,7 +14,7 @@
     </w:p>
     <w:p>
       <w:r>
-        <w:t>配套文件：合理用药_双人35分钟.pptx｜30页主讲＋3页文献附页＋2页图片来源附页</w:t>
+        <w:t>配套文件：合理用药_双人35分钟.pptx｜28页主讲＋3页文献附页＋2页图片来源附页</w:t>
       </w:r>
     </w:p>
     <w:p>
@@ -143,7 +143,7 @@
           </w:tcPr>
           <w:p>
             <w:r>
-              <w:t>6—19</w:t>
+              <w:t>6—17</w:t>
             </w:r>
           </w:p>
         </w:tc>
@@ -163,7 +163,7 @@
           </w:tcPr>
           <w:p>
             <w:r>
-              <w:t>五类宿舍误区</w:t>
+              <w:t>四类宿舍误区</w:t>
             </w:r>
           </w:p>
         </w:tc>
@@ -185,7 +185,7 @@
           </w:tcPr>
           <w:p>
             <w:r>
-              <w:t>20—26</w:t>
+              <w:t>18—24</w:t>
             </w:r>
           </w:p>
         </w:tc>
@@ -227,7 +227,7 @@
           </w:tcPr>
           <w:p>
             <w:r>
-              <w:t>27—30</w:t>
+              <w:t>25—28</w:t>
             </w:r>
           </w:p>
         </w:tc>
@@ -255,7 +255,7 @@
     </w:tbl>
     <w:p>
       <w:r>
-        <w:t>甲主讲第1—16页，计划16分55秒；乙主讲第17—30页，计划18分05秒。第29页甲补充约15秒，第30页共同收尾，实际发言时间更接近。第16页末交接，不中途介绍新身份。</w:t>
+        <w:t>甲主讲第1—14页，计划15分55秒；乙主讲第15—28页，计划19分05秒。第27页甲补充约15秒，第28页共同收尾。第14页末交接。</w:t>
       </w:r>
     </w:p>
     <w:p>
@@ -278,7 +278,7 @@
     </w:p>
     <w:p>
       <w:r>
-        <w:t>到第5页末应约5分钟，第19页末约22分钟，第26页末约30分钟。超时1分钟：压缩第18页重复解释约30秒，并将第19页同桌讨论与点评合计缩短30秒。提前1分钟：按稿中停顿完整读图，补充讨论第8页的信息缺口和第13页的两种比较假设，不要临时增加医学结论。</w:t>
+        <w:t>到第5页末约5分钟，第17页末约22分钟，第24页末约30分钟。超时1分钟：第16页投票点评和第17页角色对话各缩短约30秒。提前1分钟：让大家分别读第12页处方比例与相对风险图，补充第8页的信息核对，不临时增加医学结论。</w:t>
       </w:r>
     </w:p>
     <w:p>
@@ -306,7 +306,7 @@
     </w:p>
     <w:p>
       <w:r>
-        <w:t>甲：大家好。今天我们聊一个进入大学后越来越需要自己做决定的问题：身体不舒服时，药到底该怎么用？离开父母的提醒，宿舍药箱、室友推荐和手机搜索，可能成了我们的第一反应。但名字熟悉，不代表适合自己；药吃得多，也不代表好得快。接下来我们用五类校园情境和几轮举手选择，练习几个能直接用上的判断。我们不考药名，也不背剂量表，目标是学会看什么、问什么，以及什么时候应该就医。</w:t>
+        <w:t>甲：大家好。今天我们聊一个进入大学后越来越需要自己做决定的问题：身体不舒服时，药到底该怎么用？离开父母的提醒，宿舍药箱、室友推荐和手机搜索，可能成了我们的第一反应。但名字熟悉，不代表适合自己；药吃得多，也不代表好得快。接下来我们用四类校园情境和几轮举手选择，练习几个能直接用上的判断。我们不考药名，也不背剂量表，目标是学会看什么、问什么，以及什么时候应该就医。</w:t>
       </w:r>
     </w:p>
     <w:p>
@@ -329,7 +329,7 @@
     </w:p>
     <w:p>
       <w:r>
-        <w:t>甲：先用这张路线图，看看今天怎么给宿舍药箱上堂课。前五分钟建立判断原则；接着用十七分钟看五类校园误区：重复成分、抗生素、备考提神、抗过敏药，以及药物与饮酒。然后用八分钟练习安全用药的方法，最后五分钟替小苏做一次综合选择。甲负责前半段，乙负责后半段，举手互动已包含在时间里。大家只需选下一步，不用背药名或计算剂量。现在进入第一个情境：室友感冒了，你会先做哪一步？</w:t>
+        <w:t>甲：先看路线图。前五分钟建立判断原则；接着用十七分钟看四类校园误区：重复成分、抗生素、抗过敏药以及药物与饮酒。然后八分钟练习安全用药，最后五分钟替小苏做综合选择。甲负责前半段，乙接着讲机制与行动，举手互动已计入时间。大家不用背药名或算剂量，只选更有依据的下一步。现在进入第一个情境：室友感冒了，你会先做哪一步？</w:t>
       </w:r>
     </w:p>
     <w:p>
@@ -569,22 +569,32 @@
         <w:pStyle w:val="Heading1"/>
       </w:pPr>
       <w:r>
-        <w:t>12｜耐药：被筛选出来的是细菌</w:t>
+        <w:t>12｜不需要的抗生素，也可能带来真实伤害</w:t>
       </w:r>
     </w:p>
     <w:p>
       <w:r>
-        <w:t>主讲：甲　建议：80秒　累计：11:15—12:35</w:t>
+        <w:t>主讲：甲　建议：110秒　累计：11:15—13:05</w:t>
       </w:r>
     </w:p>
     <w:p>
       <w:r>
-        <w:t>甲：为什么不必要地用抗生素还会带来后续问题？可以借助高中生物的自然选择来理解。图中蓝色代表敏感细菌，红色代表具有耐药性的细菌。这些差异可以来自遗传变异，也可以来自耐药基因的获得。面对某种抗生素，敏感细菌更容易被抑制，具有相应耐药性的细菌可能存活并繁殖，于是群体中耐药菌的比例上升。图中的数量是教学示意，不是实验数据。这里最容易说错的一句话是“我的身体耐药了”。更准确地说，是病原菌对药物产生了抵抗能力。这个过程还涉及基因传播等因素，今天先记住选择压力这一条主线。</w:t>
+        <w:t>甲：上一页说普通感冒通常由病毒引起，抗生素没有相应治疗作用。为什么不能想着吃一点总没坏处？左边把处方比例换成一百个格子：CDC汇总至少28%的美国门诊抗生素处方被认为不必要，所引研究的这一估计来自2014—2015年。这是处方比例，不是我们班或中国大学生的发生率。右边说的是另一种风险：CDC指出，在服用抗生素期间及结束后一个月，艰难梭菌感染风险最高可达原来的10倍。艰难梭菌可能引起腹泻和结肠炎；抗生素会扰动肠道菌群，给它可乘之机。这里的最高10倍不是人人都会升高10倍，也不是10%的发生率。</w:t>
       </w:r>
     </w:p>
     <w:p>
       <w:r>
-        <w:t>本页依据：S4; S5</w:t>
+        <w:t>【给大家15秒分别读两图；问：左图数的是处方，右图比较的是什么？停顿约10秒，再解释】</w:t>
+      </w:r>
+    </w:p>
+    <w:p>
+      <w:r>
+        <w:t>甲：两图口径不同，不能把28%与10倍相乘。我们要带走的是：没有需要时吃抗生素，未必得到预期获益，却仍可能遇到副作用。确实需要时按医生方案用药，不因害怕风险自行停药。下一页把这句话换成三个实际动作。</w:t>
+      </w:r>
+    </w:p>
+    <w:p>
+      <w:r>
+        <w:t>本页依据：S5; S15; S16</w:t>
       </w:r>
     </w:p>
     <w:p>
@@ -592,40 +602,27 @@
         <w:pStyle w:val="Heading1"/>
       </w:pPr>
       <w:r>
-        <w:t>13｜495万与127万：是在回答两个问题</w:t>
+        <w:t>13｜把“别乱吃抗生素”，换成三个动作</w:t>
       </w:r>
     </w:p>
     <w:p>
       <w:r>
-        <w:t>主讲：甲　建议：70秒　累计：12:35—13:45</w:t>
+        <w:t>主讲：甲　建议：80秒　累计：13:05—14:25</w:t>
       </w:r>
     </w:p>
     <w:p>
       <w:r>
-        <w:t>甲：两个数字不是两组互不重叠的人，而是用两种假设比较同一类耐药感染的负担。相关死亡约495万人，比较实际发生这类感染与没有这类感染。归因死亡约127万人，保留感染发生，但假设细菌对抗菌药物敏感，估计耐药性额外造成的死亡。一个问如果没有这类感染，一个问感染仍在但药能对付细菌。因此不能相加，也不能把495万全部说成耐药性额外造成，更不能全部归咎于个人乱用药。右侧两条独立条形共用从零开始的刻度，点和细线表示估计与95%不确定性区间。这是2019年全球模型估计，发表于2022年。</w:t>
+        <w:t>甲：数据看完，回到小苏的药箱。第一，看见感冒症状，不自动把抗生素当作备用保险，先明确是否需要。第二，室友说这盒我吃着有效，不代表适合自己；相似症状可能来自不同原因，不接室友剩药，也不分享自己的处方。第三，确实需要时按具体处方的剂量、间隔与疗程执行，疗效或不良反应有疑问就咨询，不自己缩短、延长或加量。</w:t>
       </w:r>
     </w:p>
     <w:p>
       <w:r>
-        <w:t>本页依据：S5</w:t>
-      </w:r>
-    </w:p>
-    <w:p>
-      <w:pPr>
-        <w:pStyle w:val="Heading1"/>
-      </w:pPr>
-      <w:r>
-        <w:t>14｜抗生素的三条行动规则</w:t>
+        <w:t>【停顿10秒，让大家看三张动作卡，选一个最容易忘记的动作】</w:t>
       </w:r>
     </w:p>
     <w:p>
       <w:r>
-        <w:t>主讲：甲　建议：55秒　累计：13:45—14:40</w:t>
-      </w:r>
-    </w:p>
-    <w:p>
-      <w:r>
-        <w:t>甲：回到我们自己能做的事，记住三条。第一，不因为感冒或嗓子痛就自行启用抗生素。第二，不把自己剩下的药分给室友，也不拿室友的处方照着用。第三，确实需要时按医生给出的剂量、间隔和疗程使用，不因为感觉好一点就自行停药，也不为了“彻底一点”擅自延长。这里不是让大家出现严重反应也硬撑着吃完，而是出现异常、疗效不理想，或不知道该如何继续时，及时联系医生或药师，由专业人员调整方案。</w:t>
+        <w:t>甲：真正减少可避免风险的，是把这三个动作做出来。</w:t>
       </w:r>
     </w:p>
     <w:p>
@@ -638,50 +635,32 @@
         <w:pStyle w:val="Heading1"/>
       </w:pPr>
       <w:r>
-        <w:t>15｜考试周的“外挂”，谁在给它背书？</w:t>
+        <w:t>14｜案例③：鼻子舒服了，上课却困了</w:t>
       </w:r>
     </w:p>
     <w:p>
       <w:r>
-        <w:t>主讲：甲　建议：60秒　累计：14:40—15:40</w:t>
+        <w:t>主讲：甲　建议：90秒　累计：14:25—15:55</w:t>
       </w:r>
     </w:p>
     <w:p>
       <w:r>
-        <w:t>甲：考试周，小苏看见专注加倍、快速提分的广告，室友又说有人借用处方兴奋剂熬夜。悬念不是哪一种更厉害，而是广告和别人经验能否证明适合小苏。保健食品不能替代药物治疗疾病，功能声称不等于提分保证。处方兴奋剂对有适应证的患者，规范治疗有价值；借用他人处方进行非医疗使用，则存在失眠、焦虑、成瘾及过量等风险。合理用药要核实适用依据，不借用他人的处方，也不让考试焦虑替自己决定。</w:t>
+        <w:t>舞台提示：甲主讲至此页末；预计累计15分55秒，交给乙接着讲组胺机制。</w:t>
       </w:r>
     </w:p>
     <w:p>
       <w:r>
-        <w:t>本页依据：S6; S7</w:t>
-      </w:r>
-    </w:p>
-    <w:p>
-      <w:pPr>
-        <w:pStyle w:val="Heading1"/>
-      </w:pPr>
-      <w:r>
-        <w:t>16｜案例④：鼻子舒服了，上课却困了</w:t>
+        <w:t>甲：第三个情境，小苏的过敏症状缓解了，走进教室却犯困。左边漫画只讲一个现象：鼻子舒服与精神清醒，并不一定同时改善。右边三张提示卡给出行动顺序。先查具体药品的嗜睡提示；再向药师说清白天有课、要通勤等需要；已经困倦或反应变慢时，避开骑车、驾驶和其他高风险活动。有些药较少引起嗜睡，但个人反应仍有差异，不靠抗过敏药四个字作判断。</w:t>
       </w:r>
     </w:p>
     <w:p>
       <w:r>
-        <w:t>主讲：甲　建议：75秒　累计：15:40—16:55</w:t>
+        <w:t>【留10秒读图；甲用一句话复述：别用咖啡或酒精自行抵消这种感觉】</w:t>
       </w:r>
     </w:p>
     <w:p>
       <w:r>
-        <w:t>舞台提示：此页末交接。甲累计16分55秒；乙从第17页开始。</w:t>
-      </w:r>
-    </w:p>
-    <w:p>
-      <w:r>
-        <w:t>甲：第四幕，小苏为了缓解过敏症状服了药，鼻子舒服了，坐进教室却特别想睡觉。这并不一定是药物没有起效，而可能是某些抗组胺药带来的嗜睡作用。有些药更容易让人困，有些相对较少，但个人反应也有差异。因此，选择时要说清自己的需求，例如白天有课、需要通勤，并向药师询问是否容易嗜睡。第一次使用时尤其应留意反应，困倦或反应变慢时，不要驾驶、骑车或做其他需要高度警觉的活动。也不要自己用酒精或其他药物去“抵消”这种感觉。</w:t>
-      </w:r>
-    </w:p>
-    <w:p>
-      <w:r>
-        <w:t>甲：为什么一种药既影响鼻子，也影响清醒程度？下面交给乙，接着用生物知识解释。</w:t>
+        <w:t>甲：为什么鼻子与清醒程度会同时受影响？下面交给乙看两条作用路径。</w:t>
       </w:r>
     </w:p>
     <w:p>
@@ -694,12 +673,12 @@
         <w:pStyle w:val="Heading1"/>
       </w:pPr>
       <w:r>
-        <w:t>17｜同一种组胺信号，为什么有两种影响？</w:t>
+        <w:t>15｜同一种组胺信号，为什么有两种影响？</w:t>
       </w:r>
     </w:p>
     <w:p>
       <w:r>
-        <w:t>主讲：乙　建议：65秒　累计：16:55—18:00</w:t>
+        <w:t>主讲：乙　建议：65秒　累计：15:55—17:00</w:t>
       </w:r>
     </w:p>
     <w:p>
@@ -717,27 +696,65 @@
         <w:pStyle w:val="Heading1"/>
       </w:pPr>
       <w:r>
-        <w:t>18｜案例⑤：聚餐的酒，先缓一缓</w:t>
+        <w:t>16｜聚餐邀请到了，你先回哪条消息？</w:t>
       </w:r>
     </w:p>
     <w:p>
       <w:r>
-        <w:t>主讲：乙　建议：120秒　累计：18:00—20:00</w:t>
+        <w:t>主讲：乙　建议：150秒　累计：17:00—19:30</w:t>
       </w:r>
     </w:p>
     <w:p>
       <w:r>
-        <w:t>乙：第五个情境是聚餐。小苏白天吃了药，晚上被劝“就喝一点”。判断能不能一起用，不能只凭酒量，也不能只靠“上次没事”。酒精可能与多种药物相互作用，特别是与具有镇静作用的药物一起使用时，可能进一步影响警觉性和协调能力。对某些药物，风险还可能涉及肝脏、胃肠道等，但不同药物的机制和影响并不一样。</w:t>
+        <w:t>舞台提示：同桌讨论20秒＋举手约25秒；答案口头公布，不追问开放观点。</w:t>
       </w:r>
     </w:p>
     <w:p>
       <w:r>
-        <w:t>还有一个常见想法：把喝酒和吃药错开两小时就安全。这个时间不能通用，因为不同药物在体内停留的时间不同，饮酒情况和个体差异也会影响结果。拿不准时，最直接的行动是先不喝，带着具体药名去确认。</w:t>
+        <w:t>乙：先来一条聚餐邀请。小苏今天服过抗过敏药，但具体饮酒要求没确认。A建议垫肚子并错开时间，B建议按经验少喝，C建议先换白水再核药名。哪条消息先处理了现在的未知？</w:t>
       </w:r>
     </w:p>
     <w:p>
       <w:r>
-        <w:t>顺便说说送服药物。普通口服片剂和胶囊通常选择白水，并按说明书要求服用；不要默认咖啡、果汁、牛奶都能替代。但剂型有差别，例如含服或咀嚼的药物有自己的要求，所以最终仍然要看这盒药的具体说明。</w:t>
+        <w:t>【同桌讨论20秒，随后静默10秒；A、B、C依次举手，各约5秒】</w:t>
+      </w:r>
+    </w:p>
+    <w:p>
+      <w:r>
+        <w:t>乙：可以再想十秒：你选的是让自己感觉更放心的安排，还是获取这盒药实际要求的动作？甲只观察，不现场宣布答案，也不问个人用药史。把选择留住，下一页我们让小苏真的走进聚餐，看看这条消息怎样变成行动。</w:t>
+      </w:r>
+    </w:p>
+    <w:p>
+      <w:r>
+        <w:t>本页依据：S8; S9</w:t>
+      </w:r>
+    </w:p>
+    <w:p>
+      <w:pPr>
+        <w:pStyle w:val="Heading1"/>
+      </w:pPr>
+      <w:r>
+        <w:t>17｜案例④：聚餐这杯酒，先停一下</w:t>
+      </w:r>
+    </w:p>
+    <w:p>
+      <w:r>
+        <w:t>主讲：乙　建议：150秒　累计：19:30—22:00</w:t>
+      </w:r>
+    </w:p>
+    <w:p>
+      <w:r>
+        <w:t>乙：现在把刚才群聊题的答案放回实际聚餐。第一格，小苏白天服过抗过敏药；第二格，室友端来酒杯说就一点；第三格，小苏先换成白水，把具体药名和饮酒要求核实。答案C不是一个显得规矩的口号，而是给信息缺口留出一个核实动作。</w:t>
+      </w:r>
+    </w:p>
+    <w:p>
+      <w:r>
+        <w:t>【甲演室友：先吃点东西再喝，行不行？乙：这不能证明这个药与酒精合用安全。甲：那等两小时呢？乙：也没有适用于所有药物的统一等待时间。留约20秒表演及停顿】</w:t>
+      </w:r>
+    </w:p>
+    <w:p>
+      <w:r>
+        <w:t>乙：酒精与部分具有镇静作用的药物合用，可能增加嗜睡及反应受损风险；不同药物还可能有其他相互作用，具体看说明书或问药师。普通口服片剂或胶囊通常用白水，含服、咀嚼等剂型另有要求，仍以具体说明为准。下一步把这些判断整理成看、核、问、记。</w:t>
       </w:r>
     </w:p>
     <w:p>
@@ -750,45 +767,7 @@
         <w:pStyle w:val="Heading1"/>
       </w:pPr>
       <w:r>
-        <w:t>19｜聚餐群里的建议，哪条先解决未知？</w:t>
-      </w:r>
-    </w:p>
-    <w:p>
-      <w:r>
-        <w:t>主讲：乙　建议：120秒　累计：20:00—22:00</w:t>
-      </w:r>
-    </w:p>
-    <w:p>
-      <w:r>
-        <w:t>舞台提示：同桌讨论20秒＋举手约25秒；答案口头公布，不追问开放观点。</w:t>
-      </w:r>
-    </w:p>
-    <w:p>
-      <w:r>
-        <w:t>乙：今天服过抗过敏药，具体饮酒要求没确认。三个方案都像在控制风险：垫肚子并错开、沿用经验并少喝、换白水再核药名。请讨论二十秒，选更有依据的下一步。</w:t>
-      </w:r>
-    </w:p>
-    <w:p>
-      <w:r>
-        <w:t>【讨论20秒；依次举手各约5秒】</w:t>
-      </w:r>
-    </w:p>
-    <w:p>
-      <w:r>
-        <w:t>乙：答案C。固定等两小时、酒不烈或以前没出事，都不能证明这一药品与酒精合用没有风险。信息未确认时先不喝，再查具体说明书或问药师。</w:t>
-      </w:r>
-    </w:p>
-    <w:p>
-      <w:r>
-        <w:t>本页依据：S8; S9</w:t>
-      </w:r>
-    </w:p>
-    <w:p>
-      <w:pPr>
-        <w:pStyle w:val="Heading1"/>
-      </w:pPr>
-      <w:r>
-        <w:t>20｜安全用药四步：看、核、问、记</w:t>
+        <w:t>18｜安全用药四步：看、核、问、记</w:t>
       </w:r>
     </w:p>
     <w:p>
@@ -811,7 +790,7 @@
         <w:pStyle w:val="Heading1"/>
       </w:pPr>
       <w:r>
-        <w:t>21｜说明书很长？先定位这六处</w:t>
+        <w:t>19｜说明书很长？先定位这六处</w:t>
       </w:r>
     </w:p>
     <w:p>
@@ -839,7 +818,7 @@
         <w:pStyle w:val="Heading1"/>
       </w:pPr>
       <w:r>
-        <w:t>22｜时间、剂量、剂型，都别凭感觉改</w:t>
+        <w:t>20｜时间、剂量、剂型，都别凭感觉改</w:t>
       </w:r>
     </w:p>
     <w:p>
@@ -862,7 +841,7 @@
         <w:pStyle w:val="Heading1"/>
       </w:pPr>
       <w:r>
-        <w:t>23｜问药师时，把信息一次说清</w:t>
+        <w:t>21｜问药师时，把信息一次说清</w:t>
       </w:r>
     </w:p>
     <w:p>
@@ -885,7 +864,7 @@
         <w:pStyle w:val="Heading1"/>
       </w:pPr>
       <w:r>
-        <w:t>24｜什么时候，不该继续自己试药？</w:t>
+        <w:t>22｜什么时候，不该继续自己试药？</w:t>
       </w:r>
     </w:p>
     <w:p>
@@ -908,7 +887,7 @@
         <w:pStyle w:val="Heading1"/>
       </w:pPr>
       <w:r>
-        <w:t>25｜宿舍药箱：留信息，也留秩序</w:t>
+        <w:t>23｜宿舍药箱：留信息，也留秩序</w:t>
       </w:r>
     </w:p>
     <w:p>
@@ -931,7 +910,7 @@
         <w:pStyle w:val="Heading1"/>
       </w:pPr>
       <w:r>
-        <w:t>26｜把五个误区，换成五个动作</w:t>
+        <w:t>24｜把四个误区，换成四个动作</w:t>
       </w:r>
     </w:p>
     <w:p>
@@ -941,7 +920,7 @@
     </w:p>
     <w:p>
       <w:r>
-        <w:t>乙：在进入挑战前，我们把五个案例各换成一个动作。两盒感冒药放在面前，先核对成分。感冒后想到抗生素，先确认是否真正需要。备考时有人推荐所谓外挂，不借用别人的处方药，也不相信保证提分的宣传。吃抗过敏药后感到困倦，查看注意事项并避开风险活动。聚餐想喝酒，先确认具体药物的要求。我们没有要求大家记住几十个药名，而是练习在几个关键位置停一下。下面的小测只组合这些已经出现的动作，没有新知识，也不需要计算。</w:t>
+        <w:t>乙：挑战前，把四个情境换成四个动作：感冒药想叠加，先核成分；感冒想到抗生素，先确认是否需要；抗过敏后困倦，查提示并避开高风险活动；服药后聚餐，先核实饮酒要求。这些动作都在刚才的案例里出现过，不用背一串药名。最后的小测把它们组合起来，练习在信息缺口前停一下。</w:t>
       </w:r>
     </w:p>
     <w:p>
@@ -949,7 +928,7 @@
         <w:pStyle w:val="Heading1"/>
       </w:pPr>
       <w:r>
-        <w:t>27｜综合挑战：小苏今晚怎么安排？</w:t>
+        <w:t>25｜综合挑战：小苏今晚怎么安排？</w:t>
       </w:r>
     </w:p>
     <w:p>
@@ -967,7 +946,7 @@
         <w:pStyle w:val="Heading1"/>
       </w:pPr>
       <w:r>
-        <w:t>28｜小苏的晚间计划，你采纳哪几条？</w:t>
+        <w:t>26｜小苏的晚间计划，你采纳哪几条？</w:t>
       </w:r>
     </w:p>
     <w:p>
@@ -1000,7 +979,7 @@
         <w:pStyle w:val="Heading1"/>
       </w:pPr>
       <w:r>
-        <w:t>29｜答案 A＋B：把建议拼成完整行动</w:t>
+        <w:t>27｜答案 A＋B：把建议拼成完整行动</w:t>
       </w:r>
     </w:p>
     <w:p>
@@ -1038,7 +1017,7 @@
         <w:pStyle w:val="Heading1"/>
       </w:pPr>
       <w:r>
-        <w:t>30｜药可以常备，判断不能省略</w:t>
+        <w:t>28｜药可以常备，判断不能省略</w:t>
       </w:r>
     </w:p>
     <w:p>
@@ -1234,7 +1213,7 @@
           </w:tcPr>
           <w:p>
             <w:r>
-              <w:t>19</w:t>
+              <w:t>16</w:t>
             </w:r>
           </w:p>
         </w:tc>
@@ -1244,7 +1223,7 @@
           </w:tcPr>
           <w:p>
             <w:r>
-              <w:t>19页口头＋20页提示</w:t>
+              <w:t>17页案例揭晓</w:t>
             </w:r>
           </w:p>
         </w:tc>
@@ -1276,7 +1255,7 @@
           </w:tcPr>
           <w:p>
             <w:r>
-              <w:t>28</w:t>
+              <w:t>26</w:t>
             </w:r>
           </w:p>
         </w:tc>
@@ -1286,7 +1265,7 @@
           </w:tcPr>
           <w:p>
             <w:r>
-              <w:t>29</w:t>
+              <w:t>27</w:t>
             </w:r>
           </w:p>
         </w:tc>
@@ -1338,19 +1317,6 @@
     </w:p>
     <w:p>
       <w:r>
-        <w:t>[S3] Wolf MS, et al. Risk of Unintentional Overdose with Non-Prescription Acetaminophen Products. J Gen Intern Med. 2012;27:1587–1593. DOI: 10.1007/s11606-012-2096-3.</w:t>
-      </w:r>
-    </w:p>
-    <w:p>
-      <w:pPr>
-        <w:spacing w:after="200"/>
-      </w:pPr>
-      <w:r>
-        <w:t>https://pmc.ncbi.nlm.nih.gov/articles/PMC3509295/</w:t>
-      </w:r>
-    </w:p>
-    <w:p>
-      <w:r>
         <w:t>[S4] CDC. Healthy Habits: Antibiotic Do’s and Don’ts.</w:t>
       </w:r>
     </w:p>
@@ -1364,7 +1330,7 @@
     </w:p>
     <w:p>
       <w:r>
-        <w:t>[S5] Antimicrobial Resistance Collaborators. Global burden of bacterial antimicrobial resistance in 2019: a systematic analysis. Lancet. 2022;399:629–655. DOI: 10.1016/S0140-6736(21)02724-0.</w:t>
+        <w:t>[S5] CDC. Antibiotic Use in the United States（2025更新；门诊至少28%不必要处方）</w:t>
       </w:r>
     </w:p>
     <w:p>
@@ -1372,33 +1338,7 @@
         <w:spacing w:after="200"/>
       </w:pPr>
       <w:r>
-        <w:t>https://pmc.ncbi.nlm.nih.gov/articles/PMC8841637/</w:t>
-      </w:r>
-    </w:p>
-    <w:p>
-      <w:r>
-        <w:t>[S6] FDA（2023）Updating warnings to improve safe use of prescription stimulants used to treat ADHD and other conditions.</w:t>
-      </w:r>
-    </w:p>
-    <w:p>
-      <w:pPr>
-        <w:spacing w:after="200"/>
-      </w:pPr>
-      <w:r>
-        <w:t>https://www.fda.gov/drugs/drug-safety-communications/fda-updating-warnings-improve-safe-use-prescription-stimulants-used-treat-adhd-and-other-conditions</w:t>
-      </w:r>
-    </w:p>
-    <w:p>
-      <w:r>
-        <w:t>[S7] 市场监管总局《关于防范保健食品功能声称虚假宣传的消费提示》</w:t>
-      </w:r>
-    </w:p>
-    <w:p>
-      <w:pPr>
-        <w:spacing w:after="200"/>
-      </w:pPr>
-      <w:r>
-        <w:t>https://www.samr.gov.cn/xw/zj/art/2023/art_d03ccbcf0c7e482198c4adfa23f9e59a.html</w:t>
+        <w:t>https://www.cdc.gov/antibiotic-use/hcp/data-research/antibiotic-prescribing.html</w:t>
       </w:r>
     </w:p>
     <w:p>
@@ -1490,6 +1430,32 @@
       </w:pPr>
       <w:r>
         <w:t>https://pmc.ncbi.nlm.nih.gov/articles/PMC3650962/</w:t>
+      </w:r>
+    </w:p>
+    <w:p>
+      <w:r>
+        <w:t>[S15] CDC. About C. diff（2026更新；用药期间及结束后1个月感染风险最高10倍）</w:t>
+      </w:r>
+    </w:p>
+    <w:p>
+      <w:pPr>
+        <w:spacing w:after="200"/>
+      </w:pPr>
+      <w:r>
+        <w:t>https://www.cdc.gov/c-diff/about/</w:t>
+      </w:r>
+    </w:p>
+    <w:p>
+      <w:r>
+        <w:t>[S16] Hersh AL et al. Unnecessary Antibiotic Prescribing in US Ambulatory Care Settings, 2010–2015. Clin Infect Dis. 2021;72:133–137.</w:t>
+      </w:r>
+    </w:p>
+    <w:p>
+      <w:pPr>
+        <w:spacing w:after="200"/>
+      </w:pPr>
+      <w:r>
+        <w:t>https://stacks.cdc.gov/view/cdc/120299/cdc_120299_DS1.pdf</w:t>
       </w:r>
     </w:p>
     <w:sectPr>

</xml_diff>

<commit_message>
deliver: synchronize speaker script and interaction pages
</commit_message>
<xml_diff>
--- a/交付文件/合理用药_双人逐页讲稿.docx
+++ b/交付文件/合理用药_双人逐页讲稿.docx
@@ -14,7 +14,7 @@
     </w:p>
     <w:p>
       <w:r>
-        <w:t>配套文件：合理用药_双人35分钟.pptx｜28页主讲＋3页文献附页＋2页图片来源附页</w:t>
+        <w:t>配套文件：合理用药_双人35分钟.pptx｜27页主讲＋3页文献附页＋2页图片来源附页</w:t>
       </w:r>
     </w:p>
     <w:p>
@@ -101,7 +101,7 @@
           </w:tcPr>
           <w:p>
             <w:r>
-              <w:t>1—5</w:t>
+              <w:t>1—4</w:t>
             </w:r>
           </w:p>
         </w:tc>
@@ -143,7 +143,7 @@
           </w:tcPr>
           <w:p>
             <w:r>
-              <w:t>6—17</w:t>
+              <w:t>5—16</w:t>
             </w:r>
           </w:p>
         </w:tc>
@@ -185,7 +185,7 @@
           </w:tcPr>
           <w:p>
             <w:r>
-              <w:t>18—24</w:t>
+              <w:t>17—23</w:t>
             </w:r>
           </w:p>
         </w:tc>
@@ -227,7 +227,7 @@
           </w:tcPr>
           <w:p>
             <w:r>
-              <w:t>25—28</w:t>
+              <w:t>24—27</w:t>
             </w:r>
           </w:p>
         </w:tc>
@@ -255,7 +255,7 @@
     </w:tbl>
     <w:p>
       <w:r>
-        <w:t>甲主讲第1—14页，计划15分55秒；乙主讲第15—28页，计划19分05秒。第27页甲补充约15秒，第28页共同收尾。第14页末交接。</w:t>
+        <w:t>甲主讲第1—13页，计划15分55秒；乙主讲第14—27页，计划19分05秒。第26页甲补充约15秒，第27页共同收尾。第13页末交接。</w:t>
       </w:r>
     </w:p>
     <w:p>
@@ -278,7 +278,7 @@
     </w:p>
     <w:p>
       <w:r>
-        <w:t>到第5页末约5分钟，第17页末约22分钟，第24页末约30分钟。超时1分钟：第16页投票点评和第17页角色对话各缩短约30秒。提前1分钟：让大家分别读第12页处方比例与相对风险图，补充第8页的信息核对，不临时增加医学结论。</w:t>
+        <w:t>到第4页末约5分钟，第16页末约22分钟，第23页末约30分钟。超时1分钟：第15页投票点评和第16页角色对话各缩短约30秒。提前1分钟：让大家读第11页处方格子与急诊图标，补充第7页的信息核对，不临时增加医学结论。</w:t>
       </w:r>
     </w:p>
     <w:p>
@@ -375,12 +375,17 @@
     </w:p>
     <w:p>
       <w:r>
-        <w:t>主讲：甲　建议：60秒　累计：03:00—04:00</w:t>
+        <w:t>主讲：甲　建议：120秒　累计：03:00—05:00</w:t>
       </w:r>
     </w:p>
     <w:p>
       <w:r>
         <w:t>甲：合理用药可以用四个词记住：安全、有效、经济、适宜。安全不是承诺任何药都没有风险，而是识别禁忌和可能的不良反应。有效，是药物针对的问题与实际需要相符。经济，是在满足治疗需要的前提下，避免不必要的药物和花费。适宜，则提醒我们，同一个药对室友合适，对自己不一定合适，年龄、过敏史、正在使用的其他药物，都可能影响选择。所以开场选B，是先把这些信息补齐，而不是看到一个症状就直接往药箱里伸手。</w:t>
+      </w:r>
+    </w:p>
+    <w:p>
+      <w:r>
+        <w:t>【增加一分钟情境比较：同桌讨论30秒——室友剩药便宜、广告药很热门，各会卡在哪一道关？再用30秒邀请举手并串联四关。经济不只是便宜，适宜也不等于别人有效。】</w:t>
       </w:r>
     </w:p>
     <w:p>
@@ -393,30 +398,7 @@
         <w:pStyle w:val="Heading1"/>
       </w:pPr>
       <w:r>
-        <w:t>05｜鼻子舒服了，为什么上课却犯困？</w:t>
-      </w:r>
-    </w:p>
-    <w:p>
-      <w:r>
-        <w:t>主讲：甲　建议：60秒　累计：04:00—05:00</w:t>
-      </w:r>
-    </w:p>
-    <w:p>
-      <w:r>
-        <w:t>甲：小苏吃了抗过敏药，鼻子舒服了，上课却开始犯困。药明明在起作用，怎么还会影响精神？先看图里的两个位置：组胺在鼻部参与部分过敏反应，在脑内也参与维持清醒。部分抗组胺药能进入脑内，影响相关信号，因此可能在缓解过敏症状的同时让人困倦。这就是生物课里的“信号传递”在生活中的一个例子：同一种信号物质，在不同位置可以参与不同功能。不是所有抗过敏药都一样，也不是人人都会困。对我们有用的结论是：选择药物时，不只问能不能缓解症状，还要查嗜睡提示，向药师说清白天有课或需要通勤；已经困倦时，避免驾驶、骑车等高风险活动。后面再展开解释这个机制。</w:t>
-      </w:r>
-    </w:p>
-    <w:p>
-      <w:r>
-        <w:t>本页依据：S8</w:t>
-      </w:r>
-    </w:p>
-    <w:p>
-      <w:pPr>
-        <w:pStyle w:val="Heading1"/>
-      </w:pPr>
-      <w:r>
-        <w:t>06｜两盒药，是“双保险”还是撞车？</w:t>
+        <w:t>05｜两盒药，是“双保险”还是撞车？</w:t>
       </w:r>
     </w:p>
     <w:p>
@@ -439,7 +421,7 @@
         <w:pStyle w:val="Heading1"/>
       </w:pPr>
       <w:r>
-        <w:t>07｜药盒不同，成分可能“撞车”</w:t>
+        <w:t>06｜药盒不同，成分可能“撞车”</w:t>
       </w:r>
     </w:p>
     <w:p>
@@ -462,7 +444,7 @@
         <w:pStyle w:val="Heading1"/>
       </w:pPr>
       <w:r>
-        <w:t>08｜18点吃过药，20点还痛：先补哪条信息？</w:t>
+        <w:t>07｜18点吃过药，20点还痛：先补哪条信息？</w:t>
       </w:r>
     </w:p>
     <w:p>
@@ -485,7 +467,7 @@
         <w:pStyle w:val="Heading1"/>
       </w:pPr>
       <w:r>
-        <w:t>09｜室友群的三条消息，你给哪条点赞？</w:t>
+        <w:t>08｜室友群的三条消息，你给哪条点赞？</w:t>
       </w:r>
     </w:p>
     <w:p>
@@ -523,7 +505,7 @@
         <w:pStyle w:val="Heading1"/>
       </w:pPr>
       <w:r>
-        <w:t>10｜答案 A＋C：先把两类信息凑齐</w:t>
+        <w:t>09｜答案 A＋C：先把两类信息凑齐</w:t>
       </w:r>
     </w:p>
     <w:p>
@@ -546,7 +528,7 @@
         <w:pStyle w:val="Heading1"/>
       </w:pPr>
       <w:r>
-        <w:t>11｜案例②：抗生素，不是感冒的通用答案</w:t>
+        <w:t>10｜案例②：抗生素，不是感冒的通用答案</w:t>
       </w:r>
     </w:p>
     <w:p>
@@ -569,7 +551,7 @@
         <w:pStyle w:val="Heading1"/>
       </w:pPr>
       <w:r>
-        <w:t>12｜不需要的抗生素，也可能带来真实伤害</w:t>
+        <w:t>11｜不需要的抗生素，也可能带来真实伤害</w:t>
       </w:r>
     </w:p>
     <w:p>
@@ -579,17 +561,22 @@
     </w:p>
     <w:p>
       <w:r>
-        <w:t>甲：上一页说普通感冒通常由病毒引起，抗生素没有相应治疗作用。为什么不能想着吃一点总没坏处？左边把处方比例换成一百个格子：CDC汇总至少28%的美国门诊抗生素处方被认为不必要，所引研究的这一估计来自2014—2015年。这是处方比例，不是我们班或中国大学生的发生率。右边说的是另一种风险：CDC指出，在服用抗生素期间及结束后一个月，艰难梭菌感染风险最高可达原来的10倍。艰难梭菌可能引起腹泻和结肠炎；抗生素会扰动肠道菌群，给它可乘之机。这里的最高10倍不是人人都会升高10倍，也不是10%的发生率。</w:t>
+        <w:t>甲：上一页说普通感冒通常由病毒引起，抗生素没有相应治疗作用。为什么不能想着吃一点总没坏处？左边一百格中，高亮28格：CDC汇总至少28%的美国门诊抗生素处方被估计为不必要，所引研究该估计来自2014—2015年。这是美国门诊处方比例，不是中国大学生的发生率，其余格子也不代表全部合理。</w:t>
       </w:r>
     </w:p>
     <w:p>
       <w:r>
-        <w:t>【给大家15秒分别读两图；问：左图数的是处方，右图比较的是什么？停顿约10秒，再解释】</w:t>
+        <w:t>右边换成五个急诊图标：CDC介绍，药物相关急诊中，约五次就有一次来自抗生素反应。常见副作用包括皮疹、恶心、腹泻，严重时可出现严重过敏等。这里数的是药物反应相关急诊，不是所有急诊，不是说五个吃抗生素的人就有一个进急诊，也不能把所有这些事件都归为滥用。</w:t>
       </w:r>
     </w:p>
     <w:p>
       <w:r>
-        <w:t>甲：两图口径不同，不能把28%与10倍相乘。我们要带走的是：没有需要时吃抗生素，未必得到预期获益，却仍可能遇到副作用。确实需要时按医生方案用药，不因害怕风险自行停药。下一页把这句话换成三个实际动作。</w:t>
+        <w:t>【留15秒读五个图标；问：若治疗不需要，额外承担这样的风险值不值？停10秒】</w:t>
+      </w:r>
+    </w:p>
+    <w:p>
+      <w:r>
+        <w:t>甲：两幅图分别展示不必要的处方与药物反应造成的急诊负担，不能相乘推算个人概率。我们要带走的是：没有需要时吃抗生素，未必得到预期获益，却仍可能遇到副作用；确实需要时，规范使用的获益可以超过风险，不自行停药。下一页把结论换成三个实际动作。</w:t>
       </w:r>
     </w:p>
     <w:p>
@@ -602,7 +589,7 @@
         <w:pStyle w:val="Heading1"/>
       </w:pPr>
       <w:r>
-        <w:t>13｜把“别乱吃抗生素”，换成三个动作</w:t>
+        <w:t>12｜把“别乱吃抗生素”，换成三个动作</w:t>
       </w:r>
     </w:p>
     <w:p>
@@ -635,7 +622,7 @@
         <w:pStyle w:val="Heading1"/>
       </w:pPr>
       <w:r>
-        <w:t>14｜案例③：鼻子舒服了，上课却困了</w:t>
+        <w:t>13｜案例③：鼻子舒服了，上课却犯困</w:t>
       </w:r>
     </w:p>
     <w:p>
@@ -650,17 +637,17 @@
     </w:p>
     <w:p>
       <w:r>
-        <w:t>甲：第三个情境，小苏的过敏症状缓解了，走进教室却犯困。左边漫画只讲一个现象：鼻子舒服与精神清醒，并不一定同时改善。右边三张提示卡给出行动顺序。先查具体药品的嗜睡提示；再向药师说清白天有课、要通勤等需要；已经困倦或反应变慢时，避开骑车、驾驶和其他高风险活动。有些药较少引起嗜睡，但个人反应仍有差异，不靠抗过敏药四个字作判断。</w:t>
+        <w:t>甲：第三个案例换到课堂。小苏用了抗过敏药，终于不用一直擦鼻涕，却开始听不清老师在讲什么。先看两幅画，同一种用药经历带来了两个结果：鼻部舒服了，精神却不如平时。药物的治疗作用和其他影响可能同时出现。不是所有抗过敏药都一样，也不是人人都会困。</w:t>
       </w:r>
     </w:p>
     <w:p>
       <w:r>
-        <w:t>【留10秒读图；甲用一句话复述：别用咖啡或酒精自行抵消这种感觉】</w:t>
+        <w:t>【留15秒看两幅图；请大家用一句话描述前后变化，再给10秒思考：下午有课、晚上要骑车，会向药师补充什么信息？】</w:t>
       </w:r>
     </w:p>
     <w:p>
       <w:r>
-        <w:t>甲：为什么鼻子与清醒程度会同时受影响？下面交给乙看两条作用路径。</w:t>
+        <w:t>甲：先查具体药品的嗜睡提示，把上课、通勤和其他用药告诉药师；已经困倦或反应变慢时，避开驾驶、骑车等高风险活动。别靠咖啡或酒精自行抵消这种感觉。为什么鼻子与清醒程度会同时受影响？下面交给乙，从组胺信号的两个位置来解释。</w:t>
       </w:r>
     </w:p>
     <w:p>
@@ -673,7 +660,7 @@
         <w:pStyle w:val="Heading1"/>
       </w:pPr>
       <w:r>
-        <w:t>15｜同一种组胺信号，为什么有两种影响？</w:t>
+        <w:t>14｜同一种组胺信号，为什么有两种影响？</w:t>
       </w:r>
     </w:p>
     <w:p>
@@ -696,7 +683,7 @@
         <w:pStyle w:val="Heading1"/>
       </w:pPr>
       <w:r>
-        <w:t>16｜聚餐邀请到了，你先回哪条消息？</w:t>
+        <w:t>15｜聚餐邀请到了，你先回哪条消息？</w:t>
       </w:r>
     </w:p>
     <w:p>
@@ -734,7 +721,7 @@
         <w:pStyle w:val="Heading1"/>
       </w:pPr>
       <w:r>
-        <w:t>17｜案例④：聚餐这杯酒，先停一下</w:t>
+        <w:t>16｜案例④：聚餐这杯酒，先停一下</w:t>
       </w:r>
     </w:p>
     <w:p>
@@ -767,7 +754,7 @@
         <w:pStyle w:val="Heading1"/>
       </w:pPr>
       <w:r>
-        <w:t>18｜安全用药四步：看、核、问、记</w:t>
+        <w:t>17｜安全用药四步：看、核、问、记</w:t>
       </w:r>
     </w:p>
     <w:p>
@@ -790,7 +777,7 @@
         <w:pStyle w:val="Heading1"/>
       </w:pPr>
       <w:r>
-        <w:t>19｜说明书很长？先定位这六处</w:t>
+        <w:t>18｜说明书很长？先定位这六处</w:t>
       </w:r>
     </w:p>
     <w:p>
@@ -818,7 +805,7 @@
         <w:pStyle w:val="Heading1"/>
       </w:pPr>
       <w:r>
-        <w:t>20｜时间、剂量、剂型，都别凭感觉改</w:t>
+        <w:t>19｜时间、剂量、剂型，都别凭感觉改</w:t>
       </w:r>
     </w:p>
     <w:p>
@@ -841,7 +828,7 @@
         <w:pStyle w:val="Heading1"/>
       </w:pPr>
       <w:r>
-        <w:t>21｜问药师时，把信息一次说清</w:t>
+        <w:t>20｜问药师时，把信息一次说清</w:t>
       </w:r>
     </w:p>
     <w:p>
@@ -864,7 +851,7 @@
         <w:pStyle w:val="Heading1"/>
       </w:pPr>
       <w:r>
-        <w:t>22｜什么时候，不该继续自己试药？</w:t>
+        <w:t>21｜什么时候，不该继续自己试药？</w:t>
       </w:r>
     </w:p>
     <w:p>
@@ -887,7 +874,7 @@
         <w:pStyle w:val="Heading1"/>
       </w:pPr>
       <w:r>
-        <w:t>23｜宿舍药箱：留信息，也留秩序</w:t>
+        <w:t>22｜宿舍药箱：留信息，也留秩序</w:t>
       </w:r>
     </w:p>
     <w:p>
@@ -910,7 +897,7 @@
         <w:pStyle w:val="Heading1"/>
       </w:pPr>
       <w:r>
-        <w:t>24｜把四个误区，换成四个动作</w:t>
+        <w:t>23｜把四个误区，换成四个动作</w:t>
       </w:r>
     </w:p>
     <w:p>
@@ -928,7 +915,7 @@
         <w:pStyle w:val="Heading1"/>
       </w:pPr>
       <w:r>
-        <w:t>25｜综合挑战：小苏今晚怎么安排？</w:t>
+        <w:t>24｜综合挑战：小苏今晚怎么安排？</w:t>
       </w:r>
     </w:p>
     <w:p>
@@ -946,7 +933,7 @@
         <w:pStyle w:val="Heading1"/>
       </w:pPr>
       <w:r>
-        <w:t>26｜小苏的晚间计划，你采纳哪几条？</w:t>
+        <w:t>25｜小苏的晚间计划，你采纳哪几条？</w:t>
       </w:r>
     </w:p>
     <w:p>
@@ -979,7 +966,7 @@
         <w:pStyle w:val="Heading1"/>
       </w:pPr>
       <w:r>
-        <w:t>27｜答案 A＋B：把建议拼成完整行动</w:t>
+        <w:t>26｜答案 A＋B：把建议拼成完整行动</w:t>
       </w:r>
     </w:p>
     <w:p>
@@ -1017,7 +1004,7 @@
         <w:pStyle w:val="Heading1"/>
       </w:pPr>
       <w:r>
-        <w:t>28｜药可以常备，判断不能省略</w:t>
+        <w:t>27｜药可以常备，判断不能省略</w:t>
       </w:r>
     </w:p>
     <w:p>
@@ -1171,7 +1158,7 @@
           </w:tcPr>
           <w:p>
             <w:r>
-              <w:t>9</w:t>
+              <w:t>8</w:t>
             </w:r>
           </w:p>
         </w:tc>
@@ -1181,7 +1168,7 @@
           </w:tcPr>
           <w:p>
             <w:r>
-              <w:t>10</w:t>
+              <w:t>9</w:t>
             </w:r>
           </w:p>
         </w:tc>
@@ -1213,7 +1200,7 @@
           </w:tcPr>
           <w:p>
             <w:r>
-              <w:t>16</w:t>
+              <w:t>15</w:t>
             </w:r>
           </w:p>
         </w:tc>
@@ -1223,7 +1210,7 @@
           </w:tcPr>
           <w:p>
             <w:r>
-              <w:t>17页案例揭晓</w:t>
+              <w:t>16页案例揭晓</w:t>
             </w:r>
           </w:p>
         </w:tc>
@@ -1255,7 +1242,7 @@
           </w:tcPr>
           <w:p>
             <w:r>
-              <w:t>26</w:t>
+              <w:t>25</w:t>
             </w:r>
           </w:p>
         </w:tc>
@@ -1265,7 +1252,7 @@
           </w:tcPr>
           <w:p>
             <w:r>
-              <w:t>27</w:t>
+              <w:t>26</w:t>
             </w:r>
           </w:p>
         </w:tc>
@@ -1434,7 +1421,7 @@
     </w:p>
     <w:p>
       <w:r>
-        <w:t>[S15] CDC. About C. diff（2026更新；用药期间及结束后1个月感染风险最高10倍）</w:t>
+        <w:t>[S15] CDC. Do antibiotics have side effects?（药物相关急诊约1/5来自抗生素反应）</w:t>
       </w:r>
     </w:p>
     <w:p>
@@ -1442,7 +1429,7 @@
         <w:spacing w:after="200"/>
       </w:pPr>
       <w:r>
-        <w:t>https://www.cdc.gov/c-diff/about/</w:t>
+        <w:t>https://www.cdc.gov/antibiotic-use/media/pdfs/Do-Antibiotics-Have-Side-Effects-508.pdf</w:t>
       </w:r>
     </w:p>
     <w:p>

</xml_diff>

<commit_message>
deliver: synchronize narration and late-section transitions
</commit_message>
<xml_diff>
--- a/交付文件/合理用药_双人逐页讲稿.docx
+++ b/交付文件/合理用药_双人逐页讲稿.docx
@@ -14,7 +14,7 @@
     </w:p>
     <w:p>
       <w:r>
-        <w:t>配套文件：合理用药_双人35分钟.pptx｜27页主讲＋3页文献附页＋2页图片来源附页</w:t>
+        <w:t>配套文件：合理用药_双人35分钟.pptx｜27页主讲＋3页文献附页＋1页动漫素材附页</w:t>
       </w:r>
     </w:p>
     <w:p>
@@ -754,7 +754,7 @@
         <w:pStyle w:val="Heading1"/>
       </w:pPr>
       <w:r>
-        <w:t>17｜安全用药四步：看、核、问、记</w:t>
+        <w:t>17｜从四个案例，走到四个用药动作</w:t>
       </w:r>
     </w:p>
     <w:p>
@@ -769,6 +769,11 @@
     </w:p>
     <w:p>
       <w:r>
+        <w:t>乙：下一页从“看”开始，把说明书里会影响判断的信息找出来。</w:t>
+      </w:r>
+    </w:p>
+    <w:p>
+      <w:r>
         <w:t>本页依据：S1; S2; S8; S9</w:t>
       </w:r>
     </w:p>
@@ -777,7 +782,7 @@
         <w:pStyle w:val="Heading1"/>
       </w:pPr>
       <w:r>
-        <w:t>18｜说明书很长？先定位这六处</w:t>
+        <w:t>18｜说明书：先找能改变判断的信息</w:t>
       </w:r>
     </w:p>
     <w:p>
@@ -797,6 +802,11 @@
     </w:p>
     <w:p>
       <w:r>
+        <w:t>乙：找到用法以后，还要避免自己随意改变它，下一页看三个常见做法。</w:t>
+      </w:r>
+    </w:p>
+    <w:p>
+      <w:r>
         <w:t>本页依据：S1; S2; S8</w:t>
       </w:r>
     </w:p>
@@ -805,7 +815,7 @@
         <w:pStyle w:val="Heading1"/>
       </w:pPr>
       <w:r>
-        <w:t>19｜时间、剂量、剂型，都别凭感觉改</w:t>
+        <w:t>19｜核完说明书，使用方式也别随意改</w:t>
       </w:r>
     </w:p>
     <w:p>
@@ -820,6 +830,11 @@
     </w:p>
     <w:p>
       <w:r>
+        <w:t>乙：核对后仍拿不准，就带着具体信息去问。下一页把咨询整理成三句话。</w:t>
+      </w:r>
+    </w:p>
+    <w:p>
+      <w:r>
         <w:t>本页依据：S10; S13; S4</w:t>
       </w:r>
     </w:p>
@@ -828,7 +843,7 @@
         <w:pStyle w:val="Heading1"/>
       </w:pPr>
       <w:r>
-        <w:t>20｜问药师时，把信息一次说清</w:t>
+        <w:t>20｜拿不准时，把三件事告诉药师</w:t>
       </w:r>
     </w:p>
     <w:p>
@@ -843,6 +858,11 @@
     </w:p>
     <w:p>
       <w:r>
+        <w:t>乙：但出现严重信号时，优先求助，不把常规咨询当作等待的理由。下一页区分几种行动。</w:t>
+      </w:r>
+    </w:p>
+    <w:p>
+      <w:r>
         <w:t>本页依据：S2; S1</w:t>
       </w:r>
     </w:p>
@@ -851,7 +871,7 @@
         <w:pStyle w:val="Heading1"/>
       </w:pPr>
       <w:r>
-        <w:t>21｜什么时候，不该继续自己试药？</w:t>
+        <w:t>21｜出现这些信号，别继续自己试药</w:t>
       </w:r>
     </w:p>
     <w:p>
@@ -866,6 +886,11 @@
     </w:p>
     <w:p>
       <w:r>
+        <w:t>乙：无论咨询还是就医，都需要说清用过什么。下一页把这份信息留在药箱和记录里。</w:t>
+      </w:r>
+    </w:p>
+    <w:p>
+      <w:r>
         <w:t>本页依据：S2; S11; S12</w:t>
       </w:r>
     </w:p>
@@ -874,7 +899,7 @@
         <w:pStyle w:val="Heading1"/>
       </w:pPr>
       <w:r>
-        <w:t>22｜宿舍药箱：留信息，也留秩序</w:t>
+        <w:t>22｜药箱不求满，信息要留全</w:t>
       </w:r>
     </w:p>
     <w:p>
@@ -889,6 +914,11 @@
     </w:p>
     <w:p>
       <w:r>
+        <w:t>乙：包装、说明书和记录留齐后，前面四个案例就能对应到具体动作。</w:t>
+      </w:r>
+    </w:p>
+    <w:p>
+      <w:r>
         <w:t>本页依据：S2; S4</w:t>
       </w:r>
     </w:p>
@@ -897,7 +927,7 @@
         <w:pStyle w:val="Heading1"/>
       </w:pPr>
       <w:r>
-        <w:t>23｜把四个误区，换成四个动作</w:t>
+        <w:t>23｜把四个案例，变成四个下一步</w:t>
       </w:r>
     </w:p>
     <w:p>
@@ -915,7 +945,7 @@
         <w:pStyle w:val="Heading1"/>
       </w:pPr>
       <w:r>
-        <w:t>24｜综合挑战：小苏今晚怎么安排？</w:t>
+        <w:t>24｜综合挑战：两盒药，一场聚餐</w:t>
       </w:r>
     </w:p>
     <w:p>
@@ -925,7 +955,7 @@
     </w:p>
     <w:p>
       <w:r>
-        <w:t>乙：最后进入综合挑战，小苏再次登场。这次信息更完整：他今天已经服用一种复方感冒药，晚上觉得还没完全舒服，想再加另一盒，同时准备去聚餐。现在两盒药的成分没有核对，饮酒要求也不清楚，症状目前较轻，没有我们刚才提到的严重急症表现。这里不要求大家诊断他得了什么病，也不要求给他开药，只选一个更稳妥的下一步方案。请记住三个线索：已经服过药、还没核对成分、聚餐可能喝酒。下一页有三个方案，答案不会藏在复杂医学知识里。</w:t>
+        <w:t>乙：最后进入综合挑战，小苏再次登场。看三幅分镜：他今天已经服用一种复方感冒药，晚上觉得还没完全舒服，想再加另一盒，同时准备去聚餐。现在两盒药的成分没有核对，饮酒要求也不清楚，症状目前较轻，没有我们刚才提到的严重急症表现。这里不要求大家诊断他得了什么病，也不要求给他开药，只选一个更稳妥的下一步方案。图片里请记住三个线索：已经服过药、还没核对成分、聚餐可能喝酒。下一页有三个方案，答案不会藏在复杂医学知识里。</w:t>
       </w:r>
     </w:p>
     <w:p>
@@ -966,7 +996,7 @@
         <w:pStyle w:val="Heading1"/>
       </w:pPr>
       <w:r>
-        <w:t>26｜答案 A＋B：把建议拼成完整行动</w:t>
+        <w:t>26｜答案 A＋B：把两条建议一起做</w:t>
       </w:r>
     </w:p>
     <w:p>
@@ -1019,7 +1049,7 @@
     </w:p>
     <w:p>
       <w:r>
-        <w:t>乙：最后，我们把今天的内容收在三句话里。第一，先看说明书，再做用药决定，不让包装和熟悉感替我们判断。第二，核对重复成分，并记录已经服用的药物、时间和用量。第三，遇到不确定的信息，向医生或药师询问；该就医的时候，不继续靠自己试药。</w:t>
+        <w:t>乙：最后，我们把今天的内容收在三句话里。第一，先看说明书，再做用药决定，不让包装和熟悉感替我们判断。第二，核对重复成分，并记录已经服用的药物、时间、用量与反应。第三，遇到不确定的信息，向医生或药师询问；该就医的时候，不继续靠自己试药。</w:t>
       </w:r>
     </w:p>
     <w:p>

</xml_diff>

<commit_message>
deliver: update H1 and blood-brain barrier speaker notes
</commit_message>
<xml_diff>
--- a/交付文件/合理用药_双人逐页讲稿.docx
+++ b/交付文件/合理用药_双人逐页讲稿.docx
@@ -14,7 +14,7 @@
     </w:p>
     <w:p>
       <w:r>
-        <w:t>配套文件：合理用药_双人35分钟.pptx｜27页主讲＋3页文献附页＋1页动漫素材附页</w:t>
+        <w:t>配套文件：合理用药_双人35分钟.pptx｜27页主讲＋3页文献附页＋2页插图素材附页</w:t>
       </w:r>
     </w:p>
     <w:p>
@@ -660,7 +660,7 @@
         <w:pStyle w:val="Heading1"/>
       </w:pPr>
       <w:r>
-        <w:t>14｜同一种组胺信号，为什么有两种影响？</w:t>
+        <w:t>14｜抗组胺药：为什么鼻子舒服了，人却可能困？</w:t>
       </w:r>
     </w:p>
     <w:p>
@@ -670,12 +670,17 @@
     </w:p>
     <w:p>
       <w:r>
-        <w:t>乙：左侧，组胺与H1受体相关的信号参与部分过敏反应；抗组胺药影响相应受体的作用，可以缓解部分症状。右侧，脑内组胺信号也参与维持清醒。血脑屏障是进入脑内的一道选择性屏障，不是对所有药物都完全封闭；部分抗组胺药能够进入脑内，影响相关受体信号，因此可能嗜睡。两条路径解释治疗作用与其他影响为什么可能同时发生，不表示每种药、每个人都一样。具体选择看说明书和药师建议；困倦时避开驾驶、骑车等高风险活动。</w:t>
+        <w:t>乙：左侧是鼻黏膜。过敏反应中释放的组胺，可通过H1相关作用引起鼻痒、喷嚏和流涕；抗组胺药降低这些作用，缓解部分症状。右侧是脑微血管与神经元。血脑屏障主要由紧密连接的微血管内皮等结构形成，并不对所有药物完全封闭。部分抗组胺药可进入脑内，影响参与清醒的H1信号，因此可能嗜睡。不是鼻部的组胺一路跑到脑内，也不是所有药都会一样。困倦时避开驾驶、骑车等活动，具体选择看说明书或问药师。</w:t>
       </w:r>
     </w:p>
     <w:p>
       <w:r>
-        <w:t>本页依据：S8; S14</w:t>
+        <w:t>【图形核验说明，不逐字朗读】鼻部图的上方为纤毛上皮，下方为固有层、肥大细胞及感觉神经；金色点代表组胺。脑部图的红色细胞位于血管腔内，内皮、基底膜及外侧支持结构将血液与脑组织分开；蓝色点代表药物分子。紫色膜上位置为H1受体的功能标记，并非原子结构或真实配体对接模型。H1抗组胺药按资料为反向激动剂，可稳定受体非活化状态，不画成清除组胺或阻止组胺释放。两图为教学层次示意，不表达组织或分子尺度比例，不表示所有抗组胺药同样入脑。</w:t>
+      </w:r>
+    </w:p>
+    <w:p>
+      <w:r>
+        <w:t>本页依据：S8; S14; S17</w:t>
       </w:r>
     </w:p>
     <w:p>
@@ -1475,6 +1480,19 @@
         <w:t>https://stacks.cdc.gov/view/cdc/120299/cdc_120299_DS1.pdf</w:t>
       </w:r>
     </w:p>
+    <w:p>
+      <w:r>
+        <w:t>[S17] Anatomy and Physiology of the Blood-Brain Barrier（脑微血管内皮、紧密连接与支持结构）</w:t>
+      </w:r>
+    </w:p>
+    <w:p>
+      <w:pPr>
+        <w:spacing w:after="200"/>
+      </w:pPr>
+      <w:r>
+        <w:t>https://pmc.ncbi.nlm.nih.gov/articles/PMC4397166/</w:t>
+      </w:r>
+    </w:p>
     <w:sectPr>
       <w:footerReference w:type="default" r:id="rId9"/>
       <w:pgSz w:w="12240" w:h="15840"/>

</xml_diff>

<commit_message>
deliver: publish mature editorial deck and synchronized manuscript
</commit_message>
<xml_diff>
--- a/交付文件/合理用药_双人逐页讲稿.docx
+++ b/交付文件/合理用药_双人逐页讲稿.docx
@@ -14,12 +14,12 @@
     </w:p>
     <w:p>
       <w:r>
-        <w:t>配套文件：合理用药_双人35分钟.pptx｜27页主讲＋3页文献附页＋2页插图素材附页</w:t>
+        <w:t>配套文件：合理用药_双人35分钟.pptx｜27页主讲＋4页隐藏文献附页＋2页隐藏素材附页</w:t>
       </w:r>
     </w:p>
     <w:p>
       <w:r>
-        <w:t>目标：面向具有高中生物基础的非医学专业大一学生，学会处理常见用药选择并识别误区。全部小苏故事均为虚构情境；真实研究单独标明。</w:t>
+        <w:t>目标：面向具有高中生物基础的非医学专业大一学生，学会处理常见用药选择并识别误区。不同案例采用小周、晓岚、阿明与小林等虚构人物，同一故事保持人物连续；研究数据另有依据。</w:t>
       </w:r>
     </w:p>
     <w:p>
@@ -329,7 +329,7 @@
     </w:p>
     <w:p>
       <w:r>
-        <w:t>甲：先看路线图。前五分钟建立判断原则；接着用十七分钟看四类校园误区：重复成分、抗生素、抗过敏药以及药物与饮酒。然后八分钟练习安全用药，最后五分钟替小苏做综合选择。甲负责前半段，乙接着讲机制与行动，举手互动已计入时间。大家不用背药名或算剂量，只选更有依据的下一步。现在进入第一个情境：室友感冒了，你会先做哪一步？</w:t>
+        <w:t>甲：先看路线图。前五分钟建立判断原则；接着用十七分钟看四类校园误区：重复成分、抗生素、抗过敏药以及药物与饮酒。然后八分钟练习安全用药，最后五分钟替这位同学做综合选择。甲负责前半段，乙接着讲机制与行动，举手互动已计入时间。大家不用背药名或算剂量，只选更有依据的下一步。现在进入第一个情境：室友感冒了，你会先做哪一步？</w:t>
       </w:r>
     </w:p>
     <w:p>
@@ -352,7 +352,7 @@
     </w:p>
     <w:p>
       <w:r>
-        <w:t>甲：小苏流鼻涕、喉咙不舒服，明天还有课。药箱里有上次剩下的药，室友也递来一盒。沿用经验、先核信息、按症状挑药，三个方案都像是在解决问题。信息还不完整时，你选哪一个第一步？</w:t>
+        <w:t>甲：这位同学流鼻涕、喉咙不舒服，明天还有课。药箱里有上次剩下的药，室友也递来一盒。沿用经验、先核信息、按症状挑药，三个方案都像是在解决问题。信息还不完整时，你选哪一个第一步？</w:t>
       </w:r>
     </w:p>
     <w:p>
@@ -408,7 +408,7 @@
     </w:p>
     <w:p>
       <w:r>
-        <w:t>甲：小苏觉得头痛还没缓解，拿起另一盒感冒药。室友说，名字不同，一盒管头痛、一盒管感冒，听起来像双保险。三格漫画从不舒服，到听起来合理的建议，再把判断停在药盒背面。症状宣传不同，不代表有效成分不同。下一页不算剂量，只把成分摆在一起，看双保险有没有变成重复。</w:t>
+        <w:t>甲：小周觉得头痛还没缓解，拿起另一盒感冒药。室友说，名字不同，一盒管头痛、一盒管感冒，听起来像双保险。三格漫画从不舒服，到听起来合理的建议，再把判断停在药盒背面。症状宣传不同，不代表有效成分不同。下一页不算剂量，只把成分摆在一起，看双保险有没有变成重复。</w:t>
       </w:r>
     </w:p>
     <w:p>
@@ -454,7 +454,7 @@
     </w:p>
     <w:p>
       <w:r>
-        <w:t>甲：18点，小苏服过一种复方感冒药；20点仍然头痛，想加另一盒退热药。这两个时间只是故事线索，不表示隔两小时就能加药。现在要补齐两盒药的具体药名、成分、规格，以及今天何时用了多少。核对重复和累计使用，不能靠症状还在就自行加量，也不能套统一间隔。怀疑超量或误服应及时寻求医疗帮助；症状持续、加重也应按说明书就医提示处理。下一页只选获取这些信息的下一步。</w:t>
+        <w:t>甲：18点，小周服过一种复方感冒药；20点仍然头痛，想加另一盒退热药。这两个时间只是故事线索，不表示隔两小时就能加药。现在要补齐两盒药的具体药名、成分、规格，以及今天何时用了多少。核对重复和累计使用，不能靠症状还在就自行加量，也不能套统一间隔。怀疑超量或误服应及时寻求医疗帮助；症状持续、加重也应按说明书就医提示处理。下一页只选获取这些信息的下一步。</w:t>
       </w:r>
     </w:p>
     <w:p>
@@ -482,7 +482,7 @@
     </w:p>
     <w:p>
       <w:r>
-        <w:t>甲：室友群里弹出三条消息。A让我们找重复成分，B建议错开服药时间，C让我们补齐今天的药名、规格和时间。可以给多条消息点赞，选择的是现在有助于判断的建议，不是替小苏开药。</w:t>
+        <w:t>甲：室友群里弹出三条消息。A让我们找重复成分，B建议错开服药时间，C让我们补齐今天的药名、规格和时间。可以给多条消息点赞，选择的是现在有助于判断的建议，不是替小周开药。</w:t>
       </w:r>
     </w:p>
     <w:p>
@@ -538,12 +538,17 @@
     </w:p>
     <w:p>
       <w:r>
-        <w:t>甲：第二个误区是把抗生素当成感冒时的保险药。回到高中生物，细菌具有细胞结构，病毒没有完整的细胞结构，需要利用宿主细胞复制。不同类别的抗生素，可以作用于细菌的细胞壁合成、蛋白质合成等过程；对引起普通感冒的病毒，它们没有相应的治疗作用。所以流鼻涕、嗓子痛，并不能自动推出“应该吃抗生素”。当然，出现这些症状也可能有其他原因，少数病毒感染之后还可能发生细菌感染，是否需要抗生素需要评估。我们能做的是描述症状、接受判断，而不是自己拿剩药试试看。</w:t>
+        <w:t>甲：第二个误区，是把抗生素当成感冒时的保险药。左图以一种杆状细菌的结构为例：有胞膜、胞质、核糖体与遗传物质，DNA所在的拟核没有核膜。某些细菌结构或蛋白质合成等过程，可以成为抗生素的作用对象。右图以鼻病毒为例，它是普通感冒的常见病因之一，由蛋白质衣壳包裹RNA，没有细胞结构，需要依赖宿主细胞复制。抗生素没有针对普通感冒病毒的相应治疗作用。症状不能直接替代病因判断，是否需要抗生素由医生评估。</w:t>
       </w:r>
     </w:p>
     <w:p>
       <w:r>
-        <w:t>本页依据：S4; S11</w:t>
+        <w:t>【图形核对，不逐字朗读】细菌图为革兰阴性杆菌定性切面，核区无核膜，胞质内有核糖体；鼻病毒为无包膜病毒，遗传物质为单链RNA。右图不代表所有病毒都没有包膜或都是RNA病毒。两幅分别放大，不作真实尺寸比较，不宣称原子结构；依据S18、S19。</w:t>
+      </w:r>
+    </w:p>
+    <w:p>
+      <w:r>
+        <w:t>本页依据：S4; S11; S18; S19</w:t>
       </w:r>
     </w:p>
     <w:p>
@@ -599,7 +604,7 @@
     </w:p>
     <w:p>
       <w:r>
-        <w:t>甲：数据看完，回到小苏的药箱。第一，看见感冒症状，不自动把抗生素当作备用保险，先明确是否需要。第二，室友说这盒我吃着有效，不代表适合自己；相似症状可能来自不同原因，不接室友剩药，也不分享自己的处方。第三，确实需要时按具体处方的剂量、间隔与疗程执行，疗效或不良反应有疑问就咨询，不自己缩短、延长或加量。</w:t>
+        <w:t>甲：数据看完，回到这位同学的药箱。第一，看见感冒症状，不自动把抗生素当作备用保险，先明确是否需要。第二，室友说这盒我吃着有效，不代表适合自己；相似症状可能来自不同原因，不接室友剩药，也不分享自己的处方。第三，确实需要时按具体处方的剂量、间隔与疗程执行，疗效或不良反应有疑问就咨询，不自己缩短、延长或加量。</w:t>
       </w:r>
     </w:p>
     <w:p>
@@ -637,7 +642,7 @@
     </w:p>
     <w:p>
       <w:r>
-        <w:t>甲：第三个案例换到课堂。小苏用了抗过敏药，终于不用一直擦鼻涕，却开始听不清老师在讲什么。先看两幅画，同一种用药经历带来了两个结果：鼻部舒服了，精神却不如平时。药物的治疗作用和其他影响可能同时出现。不是所有抗过敏药都一样，也不是人人都会困。</w:t>
+        <w:t>甲：第三个案例换到课堂。晓岚用了抗过敏药，终于不用一直擦鼻涕，却开始听不清老师在讲什么。先看两幅画，同一种用药经历带来了两个结果：鼻部舒服了，精神却不如平时。药物的治疗作用和其他影响可能同时出现。不是所有抗过敏药都一样，也不是人人都会困。</w:t>
       </w:r>
     </w:p>
     <w:p>
@@ -703,7 +708,7 @@
     </w:p>
     <w:p>
       <w:r>
-        <w:t>乙：先来一条聚餐邀请。小苏今天服过抗过敏药，但具体饮酒要求没确认。A建议垫肚子并错开时间，B建议按经验少喝，C建议先换白水再核药名。哪条消息先处理了现在的未知？</w:t>
+        <w:t>乙：先来一条聚餐邀请。阿明今天服过抗过敏药，但具体饮酒要求没确认。A建议垫肚子并错开时间，B建议按经验少喝，C建议先换白水再核药名。哪条消息先处理了现在的未知？</w:t>
       </w:r>
     </w:p>
     <w:p>
@@ -713,7 +718,7 @@
     </w:p>
     <w:p>
       <w:r>
-        <w:t>乙：可以再想十秒：你选的是让自己感觉更放心的安排，还是获取这盒药实际要求的动作？甲只观察，不现场宣布答案，也不问个人用药史。把选择留住，下一页我们让小苏真的走进聚餐，看看这条消息怎样变成行动。</w:t>
+        <w:t>乙：可以再想十秒：你选的是让自己感觉更放心的安排，还是获取这盒药实际要求的动作？甲只观察，不现场宣布答案，也不问个人用药史。把选择留住，下一页我们让阿明真的走进聚餐，看看这条消息怎样变成行动。</w:t>
       </w:r>
     </w:p>
     <w:p>
@@ -736,7 +741,7 @@
     </w:p>
     <w:p>
       <w:r>
-        <w:t>乙：现在把刚才群聊题的答案放回实际聚餐。第一格，小苏白天服过抗过敏药；第二格，室友端来酒杯说就一点；第三格，小苏先换成白水，把具体药名和饮酒要求核实。答案C不是一个显得规矩的口号，而是给信息缺口留出一个核实动作。</w:t>
+        <w:t>乙：现在把刚才群聊题的答案放回实际聚餐。第一格，阿明白天服过抗过敏药；第二格，室友端来酒杯说就一点；第三格，阿明先换成白水，把具体药名和饮酒要求核实。答案C不是一个显得规矩的口号，而是给信息缺口留出一个核实动作。</w:t>
       </w:r>
     </w:p>
     <w:p>
@@ -960,7 +965,7 @@
     </w:p>
     <w:p>
       <w:r>
-        <w:t>乙：最后进入综合挑战，小苏再次登场。看三幅分镜：他今天已经服用一种复方感冒药，晚上觉得还没完全舒服，想再加另一盒，同时准备去聚餐。现在两盒药的成分没有核对，饮酒要求也不清楚，症状目前较轻，没有我们刚才提到的严重急症表现。这里不要求大家诊断他得了什么病，也不要求给他开药，只选一个更稳妥的下一步方案。图片里请记住三个线索：已经服过药、还没核对成分、聚餐可能喝酒。下一页有三个方案，答案不会藏在复杂医学知识里。</w:t>
+        <w:t>乙：最后进入综合挑战，换一位同学小林。看三幅分镜：她今天已经服用一种复方感冒药，晚上觉得还没完全舒服，想再加另一盒，同时准备去聚餐。现在两盒药的成分没有核对，饮酒要求也不清楚，症状目前较轻，没有我们刚才提到的严重急症表现。这里不要求大家诊断她得了什么病，也不要求给她开药，只选一个更稳妥的下一步方案。图片里请记住三个线索：已经服过药、还没核对成分、聚餐可能喝酒。下一页有三个方案，答案不会藏在复杂医学知识里。</w:t>
       </w:r>
     </w:p>
     <w:p>
@@ -968,7 +973,7 @@
         <w:pStyle w:val="Heading1"/>
       </w:pPr>
       <w:r>
-        <w:t>25｜小苏的晚间计划，你采纳哪几条？</w:t>
+        <w:t>25｜小林的晚间计划，你采纳哪几条？</w:t>
       </w:r>
     </w:p>
     <w:p>
@@ -983,7 +988,7 @@
     </w:p>
     <w:p>
       <w:r>
-        <w:t>乙：这次可以采纳多条建议。A处理聚餐饮酒的不确定性，B准备药盒和已服记录，C沿用上次经验调整第二盒的时间。请判断哪些能补齐题目里的未知信息，再把采纳的建议拼成小苏今晚的计划。</w:t>
+        <w:t>乙：这次可以采纳多条建议。A处理聚餐饮酒的不确定性，B准备药盒和已服记录，C沿用上次经验调整第二盒的时间。请判断哪些能补齐题目里的未知信息，再把采纳的建议拼成小林今晚的计划。</w:t>
       </w:r>
     </w:p>
     <w:p>
@@ -1493,6 +1498,32 @@
         <w:t>https://pmc.ncbi.nlm.nih.gov/articles/PMC4397166/</w:t>
       </w:r>
     </w:p>
+    <w:p>
+      <w:r>
+        <w:t>[S18] OpenStax. Microbiology 3.3: Unique Characteristics of Prokaryotic Cells.</w:t>
+      </w:r>
+    </w:p>
+    <w:p>
+      <w:pPr>
+        <w:spacing w:after="200"/>
+      </w:pPr>
+      <w:r>
+        <w:t>https://openstax.org/books/microbiology/pages/3-3-unique-characteristics-of-prokaryotic-cells</w:t>
+      </w:r>
+    </w:p>
+    <w:p>
+      <w:r>
+        <w:t>[S19] Rhinoviruses（鼻病毒无包膜、二十面体衣壳与单链RNA）</w:t>
+      </w:r>
+    </w:p>
+    <w:p>
+      <w:pPr>
+        <w:spacing w:after="200"/>
+      </w:pPr>
+      <w:r>
+        <w:t>https://pmc.ncbi.nlm.nih.gov/articles/PMC7173525/</w:t>
+      </w:r>
+    </w:p>
     <w:sectPr>
       <w:footerReference w:type="default" r:id="rId9"/>
       <w:pgSz w:w="12240" w:h="15840"/>

</xml_diff>